<commit_message>
v13.1 final: docx + pdf + zip regenerated from v13.1 md (option A complete)
Both .md files are v13.1 (17 dynamics, 9 advantages, ENI as partner).
Build script (build-gk-handoff-docx.js) updated to match.
DOCX + PDF + ZIP regenerated.

Final formats:
- astarter-media-content-CN.md  (26 KB)
- astarter-media-content-EN.md  (29 KB)
- astarter-media-content.docx   (1.55 MB) — 17 dynamics, 9 advantages
- astarter-media-content.pdf    (4.5 MB)
- astarter-media-content.zip    (7.8 MB)

All 5 formats now consistent. Ready to forward to Nicole/Fei-ge.
</commit_message>
<xml_diff>
--- a/astarter-gk-handoff-2026-05-24/astarter-media-content.docx
+++ b/astarter-gk-handoff-2026-05-24/astarter-media-content.docx
@@ -55,7 +55,7 @@
           <w:sz w:val="22"/>
           <w:szCs w:val="22"/>
         </w:rPr>
-        <w:t xml:space="preserve">15 个项目动态 · 项目简介 · 9 项核心优势</w:t>
+        <w:t xml:space="preserve">17 个项目动态 · 项目简介 · 9 项核心优势</w:t>
       </w:r>
     </w:p>
     <w:p>
@@ -71,7 +71,7 @@
           <w:sz w:val="16"/>
           <w:szCs w:val="16"/>
         </w:rPr>
-        <w:t xml:space="preserve">v12 · 2026.05.25</w:t>
+        <w:t xml:space="preserve">v13.1 · 2026.05.25</w:t>
       </w:r>
     </w:p>
     <w:p>
@@ -139,31 +139,39 @@
         <w:spacing w:after="160" w:line="300"/>
       </w:pPr>
       <w:r>
-        <w:t xml:space="preserve">Astarter 是面向 Web4 自主 AI Agent 经济构建的去中心化基础设施平台。项目起源于 2021 年与 Cardano 三大基石机构之一 EMURGO 的合资协议，自成立以来持续运行四产品 DeFi 堆栈——Launchpad、DEX、Money Market、Tech Service Platform。</w:t>
-      </w:r>
-    </w:p>
-    <w:p>
-      <w:pPr>
-        <w:spacing w:after="160" w:line="300"/>
-      </w:pPr>
-      <w:r>
-        <w:t xml:space="preserve">随着 AI Agent 经济在 2026 周期加速崛起，Astarter 将其既有四年生产级 DeFi 堆栈重新定位为 AI Agent 经济的清算层基础设施，并将自身定义为「构建自主 AI Agent 经济的基础设施——融合 AI Agent、DePIN 与 DeFAI」的三层一体化项目。</w:t>
-      </w:r>
-    </w:p>
-    <w:p>
-      <w:pPr>
-        <w:spacing w:after="160" w:line="300"/>
-      </w:pPr>
-      <w:r>
-        <w:t xml:space="preserve">项目近期获 OKX Ventures 与 EMURGO 共同领投，MH Ventures、Adaverse 等机构跟投，构建覆盖风险投资、交易所生态与战略合作伙伴的多层资本结构。同时与 UXLINK、AntFun、SumPlus、PayGo、ENI 公链等多家项目达成战略合作，建立覆盖社交分发、数据基础设施、AI 原生支付、跨链生态的完整合作矩阵。</w:t>
-      </w:r>
-    </w:p>
-    <w:p>
-      <w:pPr>
-        <w:spacing w:after="160" w:line="300"/>
-      </w:pPr>
-      <w:r>
-        <w:t xml:space="preserve">未来 6-12 个月内，Astarter 将加速全球 ABox 节点部署，并推出 AI 应用市场（AI Application Marketplace），为 Web4 自主智能代理生态提供更坚实的底层支撑。</w:t>
+        <w:t xml:space="preserve">Astarter 是为自主 AI 经济打造的基础设施 —— Web4 DePIN AI 原生网络。</w:t>
+      </w:r>
+    </w:p>
+    <w:p>
+      <w:pPr>
+        <w:spacing w:after="160" w:line="300"/>
+      </w:pPr>
+      <w:r>
+        <w:t xml:space="preserve">Astarter 将去中心化的 AI 智能体网络、DePIN 算力层与链上执行能力整合到一个统一堆栈，使自主 AI 智能体能够在链上独立运行、协调，并产生真实经济价值。</w:t>
+      </w:r>
+    </w:p>
+    <w:p>
+      <w:pPr>
+        <w:spacing w:after="160" w:line="300"/>
+      </w:pPr>
+      <w:r>
+        <w:t xml:space="preserve">项目核心产品 ABox 节点是 Astarter 网络的 AI 节点设备，让任何人都能运行 AI 智能体并加入全球 AI 经济。ABox 节点提供 AI Agent 执行所需的算力与执行环境，支持多智能体并行运行，并通过协议收入分享机制为节点运营者提供回报。</w:t>
+      </w:r>
+    </w:p>
+    <w:p>
+      <w:pPr>
+        <w:spacing w:after="160" w:line="300"/>
+      </w:pPr>
+      <w:r>
+        <w:t xml:space="preserve">Astarter 已获 OKX Ventures、EMURGO、Adaverse、MH Ventures、Avatar Capital、316VC、CRT Capital、Megala Ventures 等 8 家机构投资，由 OKX Ventures 与 EMURGO 共同领投。顾问团队包括 EMURGO 产品负责人 Sergio Sanchez、IOHK 非洲业务负责人 John O'Connor、IPOR Labs CEO Darren Camas。</w:t>
+      </w:r>
+    </w:p>
+    <w:p>
+      <w:pPr>
+        <w:spacing w:after="160" w:line="300"/>
+      </w:pPr>
+      <w:r>
+        <w:t xml:space="preserve">当前阶段（2026 Q3）核心里程碑：Mainnet 主网上线 + TGE 代币生成事件 + 代币经济模型落地 + ABox 节点计划 + Astarter Grant Program 启动。后续 Q4 将推出 AI DEX、ABox Agent App Store 与多链集成。</w:t>
       </w:r>
     </w:p>
     <w:p>
@@ -199,139 +207,159 @@
         <w:spacing w:after="160" w:line="300"/>
       </w:pPr>
       <w:r>
-        <w:t xml:space="preserve">以下 9 项核心优势均基于公开可核实的事实陈述，可作为媒体报道的上下文使用。</w:t>
-      </w:r>
-    </w:p>
-    <w:p>
-      <w:pPr>
-        <w:pStyle w:val="Heading3"/>
-        <w:spacing w:after="100" w:before="200"/>
-      </w:pPr>
-      <w:r>
-        <w:rPr>
-          <w:color w:val="6F00FF"/>
-        </w:rPr>
-        <w:t xml:space="preserve">01 · 头部机构资本背书</w:t>
-      </w:r>
-    </w:p>
-    <w:p>
-      <w:pPr>
-        <w:spacing w:after="160" w:line="300"/>
-      </w:pPr>
-      <w:r>
-        <w:t xml:space="preserve">获得 OKX Ventures 与 EMURGO 共同领投，同时得到 MH Ventures、Adaverse 等机构跟投。其中 OKX Ventures 代表头部交易所风投机构的认可；EMURGO 作为 Cardano 协议三大基石机构之一持续支持项目自 2021 年起的生态发展。多层资本结构覆盖风险投资、交易所生态与战略合作伙伴三个维度。</w:t>
-      </w:r>
-    </w:p>
-    <w:p>
-      <w:pPr>
-        <w:pStyle w:val="Heading3"/>
-        <w:spacing w:after="100" w:before="200"/>
-      </w:pPr>
-      <w:r>
-        <w:rPr>
-          <w:color w:val="6F00FF"/>
-        </w:rPr>
-        <w:t xml:space="preserve">02 · 四年生产级运营记录</w:t>
-      </w:r>
-    </w:p>
-    <w:p>
-      <w:pPr>
-        <w:spacing w:after="160" w:line="300"/>
-      </w:pPr>
-      <w:r>
-        <w:t xml:space="preserve">自 2021 年 9 月与 EMURGO 达成合资协议以来，Astarter 持续运行四产品 DeFi 堆栈：Launchpad（一级发行）、DEX（链上流动性）、Money Market（抵押借贷）、Tech Service Platform（开发者工具）。这是绝大多数 AI Agent 类别项目所不具备的实际操作历史。</w:t>
-      </w:r>
-    </w:p>
-    <w:p>
-      <w:pPr>
-        <w:pStyle w:val="Heading3"/>
-        <w:spacing w:after="100" w:before="200"/>
-      </w:pPr>
-      <w:r>
-        <w:rPr>
-          <w:color w:val="6F00FF"/>
-        </w:rPr>
-        <w:t xml:space="preserve">03 · DeFAI 清算层独占位置</w:t>
-      </w:r>
-    </w:p>
-    <w:p>
-      <w:pPr>
-        <w:spacing w:after="160" w:line="300"/>
-      </w:pPr>
-      <w:r>
-        <w:t xml:space="preserve">AI Agent 经济结构性分为四层：行为者、部署、协调、清算。其中前三层已有 Olas、Virtuals、Fetch.ai 等多家头部项目布局，唯独「清算层」长期处于结构性空缺状态。Astarter 凭借其既有四产品堆栈是目前在该层公开占位的代表项目之一。</w:t>
-      </w:r>
-    </w:p>
-    <w:p>
-      <w:pPr>
-        <w:pStyle w:val="Heading3"/>
-        <w:spacing w:after="100" w:before="200"/>
-      </w:pPr>
-      <w:r>
-        <w:rPr>
-          <w:color w:val="6F00FF"/>
-        </w:rPr>
-        <w:t xml:space="preserve">04 · 三层架构完整覆盖</w:t>
-      </w:r>
-    </w:p>
-    <w:p>
-      <w:pPr>
-        <w:spacing w:after="160" w:line="300"/>
-      </w:pPr>
-      <w:r>
-        <w:t xml:space="preserve">Astarter 公开承诺覆盖 AI Agent（行为者）、DePIN（算力底层）、DeFAI（金融层）三层架构。大多数同类项目仅专注单一层，Astarter 通过自身堆栈 + 战略联盟（UXLINK、AntFun、SumPlus 等）的组合方式实现三层协调，在 AI Agent 经济类别中具备结构性差异化。</w:t>
-      </w:r>
-    </w:p>
-    <w:p>
-      <w:pPr>
-        <w:pStyle w:val="Heading3"/>
-        <w:spacing w:after="100" w:before="200"/>
-      </w:pPr>
-      <w:r>
-        <w:rPr>
-          <w:color w:val="6F00FF"/>
-        </w:rPr>
-        <w:t xml:space="preserve">05 · Cardano 原生 + 多链扩展</w:t>
-      </w:r>
-    </w:p>
-    <w:p>
-      <w:pPr>
-        <w:spacing w:after="160" w:line="300"/>
-      </w:pPr>
-      <w:r>
-        <w:t xml:space="preserve">基础设施以 Cardano 作为原生锚链，承接 Cardano 在技术严谨性与机构信用方面的传统优势。同时已与 ENI 公链达成战略合作建立跨链桥，未来将逐步延伸至更多主流公链生态，覆盖跨链 AI Agent 经济活动。</w:t>
-      </w:r>
-    </w:p>
-    <w:p>
-      <w:pPr>
-        <w:pStyle w:val="Heading3"/>
-        <w:spacing w:after="100" w:before="200"/>
-      </w:pPr>
-      <w:r>
-        <w:rPr>
-          <w:color w:val="6F00FF"/>
-        </w:rPr>
-        <w:t xml:space="preserve">06 · 完整战略合作矩阵（执行 + 分发 + 数据 + 支付 + 跨链）</w:t>
-      </w:r>
-    </w:p>
-    <w:p>
-      <w:pPr>
-        <w:spacing w:after="160" w:line="300"/>
-      </w:pPr>
-      <w:r>
-        <w:t xml:space="preserve">Astarter 已建立覆盖多个关键维度的战略合作矩阵：与 UXLINK 合作分发层、与 AntFun 合作社交 DEX 与 AI 智能交易、与 SumPlus 合作 MCP DeFi 数据层、与 PayGo 合作 AI 原生支付、与 ENI 公链合作跨链生态。这一合作矩阵在 AI Agent 经济类别中具备明显的生态完整性。</w:t>
-      </w:r>
-    </w:p>
-    <w:p>
-      <w:pPr>
-        <w:pStyle w:val="Heading3"/>
-        <w:spacing w:after="100" w:before="200"/>
-      </w:pPr>
-      <w:r>
-        <w:rPr>
-          <w:color w:val="6F00FF"/>
-        </w:rPr>
-        <w:t xml:space="preserve">07 · 持续的中文加密媒体覆盖</w:t>
+        <w:t xml:space="preserve">以下 9 项核心优势均基于 Astarter 官方公开资料（官网、项目手册、X 公告等已验证来源）整理。</w:t>
+      </w:r>
+    </w:p>
+    <w:p>
+      <w:pPr>
+        <w:pStyle w:val="Heading3"/>
+        <w:spacing w:after="100" w:before="200"/>
+      </w:pPr>
+      <w:r>
+        <w:rPr>
+          <w:color w:val="6F00FF"/>
+        </w:rPr>
+        <w:t xml:space="preserve">01 · Web4 AI DePIN 基础设施定位</w:t>
+      </w:r>
+    </w:p>
+    <w:p>
+      <w:pPr>
+        <w:spacing w:after="160" w:line="300"/>
+      </w:pPr>
+      <w:r>
+        <w:t xml:space="preserve">去中心化 AI 网络，将 DePIN 算力与链上执行结合，使自主 AI 智能体能够在 Cardano 及更多公链生态中运行、协调、产生真实经济价值。这是当前 AI × Crypto 类别中少数将 AI + DePIN + 链上执行整合到单一堆栈的项目方案。</w:t>
+      </w:r>
+    </w:p>
+    <w:p>
+      <w:pPr>
+        <w:pStyle w:val="Heading3"/>
+        <w:spacing w:after="100" w:before="200"/>
+      </w:pPr>
+      <w:r>
+        <w:rPr>
+          <w:color w:val="6F00FF"/>
+        </w:rPr>
+        <w:t xml:space="preserve">02 · 8 家机构资本背书</w:t>
+      </w:r>
+    </w:p>
+    <w:p>
+      <w:pPr>
+        <w:spacing w:after="160" w:line="300"/>
+      </w:pPr>
+      <w:r>
+        <w:t xml:space="preserve">OKX Ventures 与 EMURGO 共同领投，Adaverse、MH Ventures、Avatar Capital、316VC、CRT Capital、Megala Ventures 跟投。其中 OKX Ventures 代表头部交易所风投机构的认可，EMURGO 作为 Cardano 协议三大基石机构之一持续支持项目。多元化资本结构覆盖风险投资、交易所生态与战略合作伙伴三个维度。</w:t>
+      </w:r>
+    </w:p>
+    <w:p>
+      <w:pPr>
+        <w:pStyle w:val="Heading3"/>
+        <w:spacing w:after="100" w:before="200"/>
+      </w:pPr>
+      <w:r>
+        <w:rPr>
+          <w:color w:val="6F00FF"/>
+        </w:rPr>
+        <w:t xml:space="preserve">03 · 权威顾问团队</w:t>
+      </w:r>
+    </w:p>
+    <w:p>
+      <w:pPr>
+        <w:spacing w:after="160" w:line="300"/>
+      </w:pPr>
+      <w:r>
+        <w:t xml:space="preserve">项目由三位 Web3 行业资深领袖出任顾问：Sergio Sanchez（EMURGO 产品负责人，与 Cardano 生态 Yoroi Wallet 相关联）、John O'Connor（IOHK 非洲业务负责人）、Darren Camas（IPOR Labs 首席执行官）。顾问团队为项目提供战略指导、行业资源与全球网络支持。</w:t>
+      </w:r>
+    </w:p>
+    <w:p>
+      <w:pPr>
+        <w:pStyle w:val="Heading3"/>
+        <w:spacing w:after="100" w:before="200"/>
+      </w:pPr>
+      <w:r>
+        <w:rPr>
+          <w:color w:val="6F00FF"/>
+        </w:rPr>
+        <w:t xml:space="preserve">04 · 四层 AI 经济架构</w:t>
+      </w:r>
+    </w:p>
+    <w:p>
+      <w:pPr>
+        <w:spacing w:after="160" w:line="300"/>
+      </w:pPr>
+      <w:r>
+        <w:t xml:space="preserve">Astarter 公开「四层 AI 经济架构」：L4 应用层（AI DEX、预测市场、智能体应用商店）、L3 智能体层（自主 AI 智能体）、L2 节点层（ABox DePIN 节点）、L1 基础设施层（高性能区块链 + AI 原生执行环境）。L1 是基础，L4 是用户直接接触的层级。</w:t>
+      </w:r>
+    </w:p>
+    <w:p>
+      <w:pPr>
+        <w:pStyle w:val="Heading3"/>
+        <w:spacing w:after="100" w:before="200"/>
+      </w:pPr>
+      <w:r>
+        <w:rPr>
+          <w:color w:val="6F00FF"/>
+        </w:rPr>
+        <w:t xml:space="preserve">05 · ABox 节点产品就绪</w:t>
+      </w:r>
+    </w:p>
+    <w:p>
+      <w:pPr>
+        <w:spacing w:after="160" w:line="300"/>
+      </w:pPr>
+      <w:r>
+        <w:t xml:space="preserve">ABox 是 Astarter 网络的核心 AI 节点设备，已开放三档预售：LITE ($500，12,000 名额)、PRO ($1,000，最受欢迎，4,137 名额)、MAX ($3,000，1,142 名额)。所有节点均包含收入分享与 ABox 预售白名单。节点收入来源：AI Agent 执行费、ABox 算力奖励、Agent Marketplace 收入、AI DEX 费用、预测市场费用。</w:t>
+      </w:r>
+    </w:p>
+    <w:p>
+      <w:pPr>
+        <w:pStyle w:val="Heading3"/>
+        <w:spacing w:after="100" w:before="200"/>
+      </w:pPr>
+      <w:r>
+        <w:rPr>
+          <w:color w:val="6F00FF"/>
+        </w:rPr>
+        <w:t xml:space="preserve">06 · 2026 Q3 Mainnet 主网与 TGE 即将到来</w:t>
+      </w:r>
+    </w:p>
+    <w:p>
+      <w:pPr>
+        <w:spacing w:after="160" w:line="300"/>
+      </w:pPr>
+      <w:r>
+        <w:t xml:space="preserve">2026 Q3 当前阶段核心里程碑包括：Mainnet 主网上线、TGE 代币生成事件、代币经济模型落地、ABox 节点计划、Astarter Grant Program 启动、Native AI ↔ DePIN 原生交互。具备如此明确、可验证的近期里程碑在 AI Agent 类别中相对稀缺。</w:t>
+      </w:r>
+    </w:p>
+    <w:p>
+      <w:pPr>
+        <w:pStyle w:val="Heading3"/>
+        <w:spacing w:after="100" w:before="200"/>
+      </w:pPr>
+      <w:r>
+        <w:rPr>
+          <w:color w:val="6F00FF"/>
+        </w:rPr>
+        <w:t xml:space="preserve">07 · $AA 代币经济模型清晰</w:t>
+      </w:r>
+    </w:p>
+    <w:p>
+      <w:pPr>
+        <w:spacing w:after="160" w:line="300"/>
+      </w:pPr>
+      <w:r>
+        <w:t xml:space="preserve">$AA 代币总量固定为 10 亿枚，分配涵盖生态社区、生态发展、团队、市值管理、机构投资、节点空投、社区激励七大维度。其中生态与社区占比最大（42% / 4.2 亿枚）。质押挖矿机制为每日 250,000 $AA，每 6 个月减少 10%。</w:t>
+      </w:r>
+    </w:p>
+    <w:p>
+      <w:pPr>
+        <w:pStyle w:val="Heading3"/>
+        <w:spacing w:after="100" w:before="200"/>
+      </w:pPr>
+      <w:r>
+        <w:rPr>
+          <w:color w:val="6F00FF"/>
+        </w:rPr>
+        <w:t xml:space="preserve">08 · 持续的中文加密媒体覆盖</w:t>
       </w:r>
     </w:p>
     <w:p>
@@ -351,35 +379,15 @@
         <w:rPr>
           <w:color w:val="6F00FF"/>
         </w:rPr>
-        <w:t xml:space="preserve">08 · 明确的近期执行路径</w:t>
-      </w:r>
-    </w:p>
-    <w:p>
-      <w:pPr>
-        <w:spacing w:after="160" w:line="300"/>
-      </w:pPr>
-      <w:r>
-        <w:t xml:space="preserve">未来 6-12 个月内，Astarter 将加速全球 ABox 节点部署，并推出 AI 应用市场（AI Application Marketplace），进一步强化 AI Agents 的基础设施能力。在 AI Agent 类别中，具备如此具体、近期、可验证执行路径的项目相对稀缺。</w:t>
-      </w:r>
-    </w:p>
-    <w:p>
-      <w:pPr>
-        <w:pStyle w:val="Heading3"/>
-        <w:spacing w:after="100" w:before="200"/>
-      </w:pPr>
-      <w:r>
-        <w:rPr>
-          <w:color w:val="6F00FF"/>
-        </w:rPr>
-        <w:t xml:space="preserve">09 · Web4 AI Agent 中文叙事领导</w:t>
-      </w:r>
-    </w:p>
-    <w:p>
-      <w:pPr>
-        <w:spacing w:after="160" w:line="300"/>
-      </w:pPr>
-      <w:r>
-        <w:t xml:space="preserve">Astarter 在 Cointime 平台发布的深度长文是中文加密媒体语境中首份系统性 Web 4.0 AI Agent 经济完整论点。文章引用 Messari、a16z、Delphi 等机构 2026 年研究，将 Astarter 定位为 AI Agent 基础设施市场（预计 2030 年规模超 500 亿美元）的早期布局者。</w:t>
+        <w:t xml:space="preserve">09 · 经济飞轮模型自我强化</w:t>
+      </w:r>
+    </w:p>
+    <w:p>
+      <w:pPr>
+        <w:spacing w:after="160" w:line="300"/>
+      </w:pPr>
+      <w:r>
+        <w:t xml:space="preserve">Astarter 公开「链上经济飞轮」四阶段循环：应用产生需求 → AI 智能体执行任务 → ABox 节点提供算力 → 收入回流至节点与网络。这一循环使每一次执行都强化整个网络，是项目长期可持续性的结构性基础。</w:t>
       </w:r>
     </w:p>
     <w:p>
@@ -393,15 +401,15 @@
         <w:spacing w:after="180" w:before="360"/>
       </w:pPr>
       <w:r>
-        <w:t xml:space="preserve">三、近期项目动态（15 条）</w:t>
-      </w:r>
-    </w:p>
-    <w:p>
-      <w:pPr>
-        <w:spacing w:after="160" w:line="300"/>
-      </w:pPr>
-      <w:r>
-        <w:t xml:space="preserve">以下 15 条项目动态可独立投放任意中文加密媒体，每条均包含 3 个标题备选与短稿。所有事实均来自 Astarter 官方公告、芒果财经网 5/14 文章、Cointime 5/24 长文等已验证来源。</w:t>
+        <w:t xml:space="preserve">三、近期项目动态（17 条）</w:t>
+      </w:r>
+    </w:p>
+    <w:p>
+      <w:pPr>
+        <w:spacing w:after="160" w:line="300"/>
+      </w:pPr>
+      <w:r>
+        <w:t xml:space="preserve">以下 17 条项目动态可独立投放任意中文加密媒体，每条均包含 3 个标题备选与短稿。所有事实均来自 Astarter 官方公开材料、芒果财经网 5/14 文章、Cointime 5/24 长文等已验证来源。</w:t>
       </w:r>
     </w:p>
     <w:p>
@@ -415,7 +423,7 @@
         <w:spacing w:after="180" w:before="360"/>
       </w:pPr>
       <w:r>
-        <w:t xml:space="preserve">动态 01 — Cointime 长文重磅上线</w:t>
+        <w:t xml:space="preserve">动态 01 — Astarter 官方定位：Web4 AI DePIN 基础设施</w:t>
       </w:r>
     </w:p>
     <w:p>
@@ -442,7 +450,7 @@
         <w:t xml:space="preserve">1. </w:t>
       </w:r>
       <w:r>
-        <w:t xml:space="preserve">Astarter Web4 × DeFAI 基础设施平台获 OKX Ventures 与 EMURGO 双领投 — Cointime 长文上线</w:t>
+        <w:t xml:space="preserve">Astarter 正式定位 Web4 AI DePIN 基础设施</w:t>
       </w:r>
     </w:p>
     <w:p>
@@ -457,7 +465,7 @@
         <w:t xml:space="preserve">2. </w:t>
       </w:r>
       <w:r>
-        <w:t xml:space="preserve">重磅 | Cointime 上线 Astarter 万字长文 完整阐述 AI Agent 经济清算层论点</w:t>
+        <w:t xml:space="preserve">为自主 AI 经济打造的基础设施 — Astarter 公开核心定位</w:t>
       </w:r>
     </w:p>
     <w:p>
@@ -472,7 +480,7 @@
         <w:t xml:space="preserve">3. </w:t>
       </w:r>
       <w:r>
-        <w:t xml:space="preserve">Cardano 生态首个 AI Agent 基础设施完整论点 Astarter 长文上线 Cointime</w:t>
+        <w:t xml:space="preserve">Web4 DePIN AI 原生网络 Astarter 完整定位解读</w:t>
       </w:r>
     </w:p>
     <w:p>
@@ -492,15 +500,354 @@
         <w:spacing w:after="160" w:line="300"/>
       </w:pPr>
       <w:r>
-        <w:t xml:space="preserve">2026 年 5 月 24 日，Cardano 生态基础设施平台 Astarter 联合头部加密媒体 Cointime 正式发布深度长文《Astarter Web4 × DeFAI 基础设施平台 获 OKX Ventures 与 EMURGO 双领投》，系统阐述项目在自主 AI Agent 经济中的战略定位、资本结构与执行路径。长文首次完整呈现 Astarter 的「AI Agent 经济清算层」叙事，深入分析当前 AI Agent、DePIN 与 DeFAI 三大趋势的融合架构。</w:t>
-      </w:r>
-    </w:p>
-    <w:p>
-      <w:pPr>
-        <w:spacing w:after="160" w:line="300"/>
-      </w:pPr>
-      <w:r>
-        <w:t xml:space="preserve">📰 完整长文：https://cn.cointime.ai/news/astarter-web4-x-defai-ji-chu-she-shi-ping-tai-huo-okx-ventures-yu-emurgo-shuang-ling-tou-71920</w:t>
+        <w:t xml:space="preserve">Astarter 正式确立项目核心定位：为自主 AI 经济打造的基础设施 —— Web4 DePIN AI 原生网络。项目将去中心化 AI 智能体网络、DePIN 算力层与链上执行能力整合到统一堆栈，使自主 AI 智能体能够在 Cardano 及更多公链生态中独立运行、协调，并产生真实经济价值。这是当前 AI × Crypto 类别中少数将 AI + DePIN + 链上执行整合到单一堆栈的项目方案。</w:t>
+      </w:r>
+    </w:p>
+    <w:p>
+      <w:pPr>
+        <w:spacing w:after="80"/>
+      </w:pPr>
+      <w:r>
+        <w:rPr>
+          <w:rFonts w:ascii="Consolas" w:cs="Consolas" w:eastAsia="Consolas" w:hAnsi="Consolas"/>
+          <w:color w:val="888888"/>
+          <w:sz w:val="18"/>
+          <w:szCs w:val="18"/>
+        </w:rPr>
+        <w:t xml:space="preserve">astarter.io · @AstarterDefiHub</w:t>
+      </w:r>
+    </w:p>
+    <w:p>
+      <w:r>
+        <w:br w:type="page"/>
+      </w:r>
+    </w:p>
+    <w:p>
+      <w:pPr>
+        <w:pStyle w:val="Heading1"/>
+        <w:spacing w:after="180" w:before="360"/>
+      </w:pPr>
+      <w:r>
+        <w:t xml:space="preserve">动态 02 — $AA 代币经济模型公布</w:t>
+      </w:r>
+    </w:p>
+    <w:p>
+      <w:pPr>
+        <w:pStyle w:val="Heading3"/>
+        <w:spacing w:after="100" w:before="200"/>
+      </w:pPr>
+      <w:r>
+        <w:rPr>
+          <w:color w:val="6F00FF"/>
+        </w:rPr>
+        <w:t xml:space="preserve">标题备选</w:t>
+      </w:r>
+    </w:p>
+    <w:p>
+      <w:pPr>
+        <w:spacing w:after="60"/>
+      </w:pPr>
+      <w:r>
+        <w:rPr>
+          <w:b/>
+          <w:bCs/>
+        </w:rPr>
+        <w:t xml:space="preserve">1. </w:t>
+      </w:r>
+      <w:r>
+        <w:t xml:space="preserve">Astarter 公布 $AA 代币经济模型 总量 10 亿枚 生态社区占 42%</w:t>
+      </w:r>
+    </w:p>
+    <w:p>
+      <w:pPr>
+        <w:spacing w:after="60"/>
+      </w:pPr>
+      <w:r>
+        <w:rPr>
+          <w:b/>
+          <w:bCs/>
+        </w:rPr>
+        <w:t xml:space="preserve">2. </w:t>
+      </w:r>
+      <w:r>
+        <w:t xml:space="preserve">$AA 代币分配解读：4.2 亿枚生态社区 + 1.2 亿团队 + 4 千万节点空投</w:t>
+      </w:r>
+    </w:p>
+    <w:p>
+      <w:pPr>
+        <w:spacing w:after="60"/>
+      </w:pPr>
+      <w:r>
+        <w:rPr>
+          <w:b/>
+          <w:bCs/>
+        </w:rPr>
+        <w:t xml:space="preserve">3. </w:t>
+      </w:r>
+      <w:r>
+        <w:t xml:space="preserve">Astarter $AA 代币 10 亿总量 七大分配维度 + 质押挖矿机制</w:t>
+      </w:r>
+    </w:p>
+    <w:p>
+      <w:pPr>
+        <w:pStyle w:val="Heading3"/>
+        <w:spacing w:after="100" w:before="200"/>
+      </w:pPr>
+      <w:r>
+        <w:rPr>
+          <w:color w:val="6F00FF"/>
+        </w:rPr>
+        <w:t xml:space="preserve">短稿</w:t>
+      </w:r>
+    </w:p>
+    <w:p>
+      <w:pPr>
+        <w:spacing w:after="160" w:line="300"/>
+      </w:pPr>
+      <w:r>
+        <w:t xml:space="preserve">Astarter 官方公布 $AA 代币经济模型。总量固定为 10 亿枚（1,000,000,000 $AA），分配涵盖七大维度：生态与社区 42%（4.2 亿枚）、生态发展 26%（2.6 亿枚）、ASTARTER 团队 12%（1.2 亿枚，1 年悬崖 + 4 年线性解锁）、市值管理 10%（1 亿枚）、机构投资 5%（5 千万枚，1 年悬崖 + 4 年线性解锁）、节点空投 4%（4 千万枚）、社区激励 1%（1 千万枚）。</w:t>
+      </w:r>
+    </w:p>
+    <w:p>
+      <w:pPr>
+        <w:spacing w:after="160" w:line="300"/>
+      </w:pPr>
+      <w:r>
+        <w:t xml:space="preserve">质押挖矿机制：每日 ABF 节点与质押奖励合计 250,000 $AA，每 6 个月减少 10%。</w:t>
+      </w:r>
+    </w:p>
+    <w:p>
+      <w:pPr>
+        <w:spacing w:after="80"/>
+      </w:pPr>
+      <w:r>
+        <w:rPr>
+          <w:rFonts w:ascii="Consolas" w:cs="Consolas" w:eastAsia="Consolas" w:hAnsi="Consolas"/>
+          <w:color w:val="888888"/>
+          <w:sz w:val="18"/>
+          <w:szCs w:val="18"/>
+        </w:rPr>
+        <w:t xml:space="preserve">astarter.io · @AstarterDefiHub</w:t>
+      </w:r>
+    </w:p>
+    <w:p>
+      <w:r>
+        <w:br w:type="page"/>
+      </w:r>
+    </w:p>
+    <w:p>
+      <w:pPr>
+        <w:pStyle w:val="Heading1"/>
+        <w:spacing w:after="180" w:before="360"/>
+      </w:pPr>
+      <w:r>
+        <w:t xml:space="preserve">动态 03 — ABox 节点产品开放预售（三档）</w:t>
+      </w:r>
+    </w:p>
+    <w:p>
+      <w:pPr>
+        <w:pStyle w:val="Heading3"/>
+        <w:spacing w:after="100" w:before="200"/>
+      </w:pPr>
+      <w:r>
+        <w:rPr>
+          <w:color w:val="6F00FF"/>
+        </w:rPr>
+        <w:t xml:space="preserve">标题备选</w:t>
+      </w:r>
+    </w:p>
+    <w:p>
+      <w:pPr>
+        <w:spacing w:after="60"/>
+      </w:pPr>
+      <w:r>
+        <w:rPr>
+          <w:b/>
+          <w:bCs/>
+        </w:rPr>
+        <w:t xml:space="preserve">1. </w:t>
+      </w:r>
+      <w:r>
+        <w:t xml:space="preserve">Astarter ABox 节点开放三档预售 LITE / PRO / MAX 全面登场</w:t>
+      </w:r>
+    </w:p>
+    <w:p>
+      <w:pPr>
+        <w:spacing w:after="60"/>
+      </w:pPr>
+      <w:r>
+        <w:rPr>
+          <w:b/>
+          <w:bCs/>
+        </w:rPr>
+        <w:t xml:space="preserve">2. </w:t>
+      </w:r>
+      <w:r>
+        <w:t xml:space="preserve">ABox 节点：Astarter 网络核心 AI 节点设备 即插即用支持多智能体并行</w:t>
+      </w:r>
+    </w:p>
+    <w:p>
+      <w:pPr>
+        <w:spacing w:after="60"/>
+      </w:pPr>
+      <w:r>
+        <w:rPr>
+          <w:b/>
+          <w:bCs/>
+        </w:rPr>
+        <w:t xml:space="preserve">3. </w:t>
+      </w:r>
+      <w:r>
+        <w:t xml:space="preserve">ABox 节点预售开启 节点收入涵盖 Agent 执行费、DEX 费用、预测市场费用等</w:t>
+      </w:r>
+    </w:p>
+    <w:p>
+      <w:pPr>
+        <w:pStyle w:val="Heading3"/>
+        <w:spacing w:after="100" w:before="200"/>
+      </w:pPr>
+      <w:r>
+        <w:rPr>
+          <w:color w:val="6F00FF"/>
+        </w:rPr>
+        <w:t xml:space="preserve">短稿</w:t>
+      </w:r>
+    </w:p>
+    <w:p>
+      <w:pPr>
+        <w:spacing w:after="160" w:line="300"/>
+      </w:pPr>
+      <w:r>
+        <w:t xml:space="preserve">Astarter 核心产品 ABox 节点已开放三档预售：LITE（500 美元，12,000 名额）、PRO（1,000 美元，最受欢迎，4,137 名额）、MAX（3,000 美元，1,142 名额）。</w:t>
+      </w:r>
+    </w:p>
+    <w:p>
+      <w:pPr>
+        <w:spacing w:after="160" w:line="300"/>
+      </w:pPr>
+      <w:r>
+        <w:t xml:space="preserve">ABox 是 Astarter 网络的核心 AI 节点设备，具备：开放协议（兼容主流开源 Agent 框架）、链上执行能力（智能体可直接调用智能合约执行交易/策略）、即插即用、多智能体并行运行时。</w:t>
+      </w:r>
+    </w:p>
+    <w:p>
+      <w:pPr>
+        <w:spacing w:after="160" w:line="300"/>
+      </w:pPr>
+      <w:r>
+        <w:t xml:space="preserve">所有节点均包含收入分享与 ABox 预售白名单。节点收入涵盖 AI Agent 执行费、ABox 算力奖励、Agent Marketplace 收入、AI DEX 费用、预测市场费用。</w:t>
+      </w:r>
+    </w:p>
+    <w:p>
+      <w:pPr>
+        <w:spacing w:after="80"/>
+      </w:pPr>
+      <w:r>
+        <w:rPr>
+          <w:rFonts w:ascii="Consolas" w:cs="Consolas" w:eastAsia="Consolas" w:hAnsi="Consolas"/>
+          <w:color w:val="888888"/>
+          <w:sz w:val="18"/>
+          <w:szCs w:val="18"/>
+        </w:rPr>
+        <w:t xml:space="preserve">astarter.io · @AstarterDefiHub</w:t>
+      </w:r>
+    </w:p>
+    <w:p>
+      <w:r>
+        <w:br w:type="page"/>
+      </w:r>
+    </w:p>
+    <w:p>
+      <w:pPr>
+        <w:pStyle w:val="Heading1"/>
+        <w:spacing w:after="180" w:before="360"/>
+      </w:pPr>
+      <w:r>
+        <w:t xml:space="preserve">动态 04 — 2026 Q3 Mainnet 主网与 TGE 即将到来</w:t>
+      </w:r>
+    </w:p>
+    <w:p>
+      <w:pPr>
+        <w:pStyle w:val="Heading3"/>
+        <w:spacing w:after="100" w:before="200"/>
+      </w:pPr>
+      <w:r>
+        <w:rPr>
+          <w:color w:val="6F00FF"/>
+        </w:rPr>
+        <w:t xml:space="preserve">标题备选</w:t>
+      </w:r>
+    </w:p>
+    <w:p>
+      <w:pPr>
+        <w:spacing w:after="60"/>
+      </w:pPr>
+      <w:r>
+        <w:rPr>
+          <w:b/>
+          <w:bCs/>
+        </w:rPr>
+        <w:t xml:space="preserve">1. </w:t>
+      </w:r>
+      <w:r>
+        <w:t xml:space="preserve">Astarter 2026 Q3 Mainnet 主网上线 + TGE 代币生成事件即将到来</w:t>
+      </w:r>
+    </w:p>
+    <w:p>
+      <w:pPr>
+        <w:spacing w:after="60"/>
+      </w:pPr>
+      <w:r>
+        <w:rPr>
+          <w:b/>
+          <w:bCs/>
+        </w:rPr>
+        <w:t xml:space="preserve">2. </w:t>
+      </w:r>
+      <w:r>
+        <w:t xml:space="preserve">路线图重磅 | Astarter 进入 Q3 阶段：Mainnet + TGE + ABox 节点计划 + Grant Program 同期启动</w:t>
+      </w:r>
+    </w:p>
+    <w:p>
+      <w:pPr>
+        <w:spacing w:after="60"/>
+      </w:pPr>
+      <w:r>
+        <w:rPr>
+          <w:b/>
+          <w:bCs/>
+        </w:rPr>
+        <w:t xml:space="preserve">3. </w:t>
+      </w:r>
+      <w:r>
+        <w:t xml:space="preserve">Astarter 第二阶段路线图启动 7 大里程碑同步落地</w:t>
+      </w:r>
+    </w:p>
+    <w:p>
+      <w:pPr>
+        <w:pStyle w:val="Heading3"/>
+        <w:spacing w:after="100" w:before="200"/>
+      </w:pPr>
+      <w:r>
+        <w:rPr>
+          <w:color w:val="6F00FF"/>
+        </w:rPr>
+        <w:t xml:space="preserve">短稿</w:t>
+      </w:r>
+    </w:p>
+    <w:p>
+      <w:pPr>
+        <w:spacing w:after="160" w:line="300"/>
+      </w:pPr>
+      <w:r>
+        <w:t xml:space="preserve">Astarter 进入 2026 Q3 第二阶段路线图，多项关键里程碑同步推进：Mainnet 主网上线、TGE 代币生成事件（$AA 代币上线）、代币经济模型正式落地、战略合作伙伴持续扩展、ABox 节点计划全面启动、Astarter Grant Program 启动、Native AI ↔ DePIN 原生交互上线。</w:t>
+      </w:r>
+    </w:p>
+    <w:p>
+      <w:pPr>
+        <w:spacing w:after="160" w:line="300"/>
+      </w:pPr>
+      <w:r>
+        <w:t xml:space="preserve">具备如此明确、近期且可验证执行里程碑的项目在 AI Agent 类别中相对稀缺。</w:t>
       </w:r>
     </w:p>
     <w:p>
@@ -511,9 +858,9 @@
       <w:r>
         <w:drawing>
           <wp:inline distT="0" distB="0" distL="0" distR="0">
-            <wp:extent cx="3048000" cy="3048000"/>
+            <wp:extent cx="4572000" cy="1857375"/>
             <wp:effectExtent t="0" r="0" b="0" l="0"/>
-            <wp:docPr id="1" name="dynamic-01-cointime-launch.png" descr="dynamic-01-cointime-launch.png" title="dynamic-01-cointime-launch.png"/>
+            <wp:docPr id="1" name="banner-roadmap-1180x480.png" descr="banner-roadmap-1180x480.png" title="banner-roadmap-1180x480.png"/>
             <wp:cNvGraphicFramePr>
               <a:graphicFrameLocks xmlns:a="http://schemas.openxmlformats.org/drawingml/2006/main" noChangeAspect="1"/>
             </wp:cNvGraphicFramePr>
@@ -536,7 +883,7 @@
                   <pic:spPr bwMode="auto">
                     <a:xfrm>
                       <a:off x="0" y="0"/>
-                      <a:ext cx="3048000" cy="3048000"/>
+                      <a:ext cx="4572000" cy="1857375"/>
                     </a:xfrm>
                     <a:prstGeom prst="rect">
                       <a:avLst/>
@@ -574,7 +921,7 @@
         <w:spacing w:after="180" w:before="360"/>
       </w:pPr>
       <w:r>
-        <w:t xml:space="preserve">动态 02 — Astarter × UXLINK 战略联盟</w:t>
+        <w:t xml:space="preserve">动态 05 — 8 大机构资本结构</w:t>
       </w:r>
     </w:p>
     <w:p>
@@ -601,7 +948,7 @@
         <w:t xml:space="preserve">1. </w:t>
       </w:r>
       <w:r>
-        <w:t xml:space="preserve">Astarter 与 UXLINK 达成战略联盟 共建 Web4 AI Agent 经济执行 + 分发一体化堆栈</w:t>
+        <w:t xml:space="preserve">Astarter 获 8 大机构投资 OKX Ventures + EMURGO 共同领投</w:t>
       </w:r>
     </w:p>
     <w:p>
@@ -616,7 +963,7 @@
         <w:t xml:space="preserve">2. </w:t>
       </w:r>
       <w:r>
-        <w:t xml:space="preserve">重磅联盟 | Astarter × UXLINK：AI Agent 经济首次出现执行层 + 社交分发层完整捆绑</w:t>
+        <w:t xml:space="preserve">重磅资本结构 | Astarter 完整投资人名单：OKX、EMURGO、Adaverse、MH、Avatar、316VC、CRT、Megala</w:t>
       </w:r>
     </w:p>
     <w:p>
@@ -631,7 +978,7 @@
         <w:t xml:space="preserve">3. </w:t>
       </w:r>
       <w:r>
-        <w:t xml:space="preserve">AI Agent 需要网络 互联网需要人 — Astarter × UXLINK 联手探索 Web3 下一阶段进化</w:t>
+        <w:t xml:space="preserve">OKX Ventures 与 Cardano 基石机构 EMURGO 共同押注 Astarter</w:t>
       </w:r>
     </w:p>
     <w:p>
@@ -651,23 +998,31 @@
         <w:spacing w:after="160" w:line="300"/>
       </w:pPr>
       <w:r>
-        <w:t xml:space="preserve">Astarter 宣布与 Web3 头部社交平台 UXLINK 建立战略合作。Astarter 团队对该合作的官方表述为：「Astarter 正在构建自主 AI Agent 经济的基础设施——融合 AI Agent、DePIN 与 DeFAI，使自主 AI 系统能够在链上运行、协调并创造真实经济价值。」</w:t>
-      </w:r>
-    </w:p>
-    <w:p>
-      <w:pPr>
-        <w:spacing w:after="160" w:line="300"/>
-      </w:pPr>
-      <w:r>
-        <w:t xml:space="preserve">UXLINK 作为全球领先的 Web3 社交平台之一，通过其强大的社交增长层推动大规模社交采用，连接全球用户、社区与构建者。双方将共同探索如何整合 AI 原生基础设施与社交驱动生态，加速 Web3 参与、自主协调与链上增长的下一阶段进化。</w:t>
-      </w:r>
-    </w:p>
-    <w:p>
-      <w:pPr>
-        <w:spacing w:after="160" w:line="300"/>
-      </w:pPr>
-      <w:r>
-        <w:t xml:space="preserve">「AI Agent 需要网络。互联网需要人。未来将是自主——而且是社交的。」</w:t>
+        <w:t xml:space="preserve">Astarter 项目已获 8 家机构投资，构建覆盖风险投资、交易所生态与战略合作伙伴的多元化资本结构：</w:t>
+      </w:r>
+    </w:p>
+    <w:p>
+      <w:pPr>
+        <w:spacing w:after="160" w:line="300"/>
+      </w:pPr>
+      <w:r>
+        <w:t xml:space="preserve">领投：OKX Ventures、EMURGO（Cardano 协议三大基石机构之一）。</w:t>
+      </w:r>
+    </w:p>
+    <w:p>
+      <w:pPr>
+        <w:spacing w:after="160" w:line="300"/>
+      </w:pPr>
+      <w:r>
+        <w:t xml:space="preserve">跟投：Adaverse、MH Ventures、Avatar Capital、316VC、CRT Capital、Megala Ventures。</w:t>
+      </w:r>
+    </w:p>
+    <w:p>
+      <w:pPr>
+        <w:spacing w:after="160" w:line="300"/>
+      </w:pPr>
+      <w:r>
+        <w:t xml:space="preserve">OKX Ventures 代表头部交易所风投机构的认可，EMURGO 持续支持项目自 2021 年起的生态发展。这一资本结构在 AI Agent 基础设施类别中具备显著的机构信用基础。</w:t>
       </w:r>
     </w:p>
     <w:p>
@@ -678,9 +1033,9 @@
       <w:r>
         <w:drawing>
           <wp:inline distT="0" distB="0" distL="0" distR="0">
-            <wp:extent cx="3048000" cy="3048000"/>
+            <wp:extent cx="4572000" cy="1857375"/>
             <wp:effectExtent t="0" r="0" b="0" l="0"/>
-            <wp:docPr id="1" name="dynamic-02-uxlink-alliance.png" descr="dynamic-02-uxlink-alliance.png" title="dynamic-02-uxlink-alliance.png"/>
+            <wp:docPr id="1" name="banner-investors-1180x480.png" descr="banner-investors-1180x480.png" title="banner-investors-1180x480.png"/>
             <wp:cNvGraphicFramePr>
               <a:graphicFrameLocks xmlns:a="http://schemas.openxmlformats.org/drawingml/2006/main" noChangeAspect="1"/>
             </wp:cNvGraphicFramePr>
@@ -703,7 +1058,7 @@
                   <pic:spPr bwMode="auto">
                     <a:xfrm>
                       <a:off x="0" y="0"/>
-                      <a:ext cx="3048000" cy="3048000"/>
+                      <a:ext cx="4572000" cy="1857375"/>
                     </a:xfrm>
                     <a:prstGeom prst="rect">
                       <a:avLst/>
@@ -741,7 +1096,7 @@
         <w:spacing w:after="180" w:before="360"/>
       </w:pPr>
       <w:r>
-        <w:t xml:space="preserve">动态 03 — Cointime × Astarter Twitter Space (5/12)</w:t>
+        <w:t xml:space="preserve">动态 06 — 权威顾问团队亮相</w:t>
       </w:r>
     </w:p>
     <w:p>
@@ -768,7 +1123,7 @@
         <w:t xml:space="preserve">1. </w:t>
       </w:r>
       <w:r>
-        <w:t xml:space="preserve">Cointime × Astarter Twitter Space 集结 AI Agent × Web4 多项目深度对话</w:t>
+        <w:t xml:space="preserve">Astarter 公布权威顾问团队 EMURGO + IOHK + IPOR Labs 三大行业领袖坐镇</w:t>
       </w:r>
     </w:p>
     <w:p>
@@ -783,7 +1138,7 @@
         <w:t xml:space="preserve">2. </w:t>
       </w:r>
       <w:r>
-        <w:t xml:space="preserve">AI Agents as the Autonomous Execution Layer of Web4 — Cointime × Astarter 联合 AMA 全程回顾</w:t>
+        <w:t xml:space="preserve">顾问阵容 | Sergio Sanchez (EMURGO) + John O'Connor (IOHK) + Darren Camas (IPOR Labs)</w:t>
       </w:r>
     </w:p>
     <w:p>
@@ -798,7 +1153,7 @@
         <w:t xml:space="preserve">3. </w:t>
       </w:r>
       <w:r>
-        <w:t xml:space="preserve">5/12 Cointime × Astarter Space：AstarterDefiHub × SumPlus × BrcToTheMoon × OriginsNetwork 联合探讨</w:t>
+        <w:t xml:space="preserve">Cardano 生态资深力量加持 Astarter 顾问团队解读</w:t>
       </w:r>
     </w:p>
     <w:p>
@@ -818,23 +1173,15 @@
         <w:spacing w:after="160" w:line="300"/>
       </w:pPr>
       <w:r>
-        <w:t xml:space="preserve">2026 年 5 月 12 日 20:00 (UTC+8)，Cointime 与 Astarter 联合举办 Twitter Space，主题为「AI Agents as the Autonomous Execution Layer of Web4」。本次 Space 由 Ayelle（@ayelleley）主持，集结多位 AI Agent × Web4 领域的关键项目代表：Batman（AstarterDefiHub）、Jakob（SumPlusReal 联合创始人）、Sofija（BrcToTheMoon CMO）、Austin（Global Ambassador）、Darkan（OriginsNetwork 核心团队）。</w:t>
-      </w:r>
-    </w:p>
-    <w:p>
-      <w:pPr>
-        <w:spacing w:after="160" w:line="300"/>
-      </w:pPr>
-      <w:r>
-        <w:t xml:space="preserve">讨论聚焦三大议题：AI Agent × Web4 领域的项目侧重、AI Agent 首先颠覆的领域（DeFi / 交易 / 链上资产管理）、未来 6-12 个月最具行动力的机会。本次 Space 是 Astarter 与 Cointime 媒体合作矩阵的标志性事件，奠定了后续深度长文上线的叙事基础。</w:t>
-      </w:r>
-    </w:p>
-    <w:p>
-      <w:pPr>
-        <w:spacing w:after="160" w:line="300"/>
-      </w:pPr>
-      <w:r>
-        <w:t xml:space="preserve">🔗 Space 回放：https://x.com/i/spaces/1akbd/i/spaces/1KbdbAWnBkJX</w:t>
+        <w:t xml:space="preserve">Astarter 公布项目顾问团队，由三位 Web3 行业资深领袖出任：Sergio Sanchez（EMURGO 产品负责人，与 Cardano 生态 Yoroi Wallet 相关联）、John O'Connor（IOHK 非洲业务负责人，IOHK 是 Cardano 的核心开发实体）、Darren Camas（IPOR Labs 首席执行官）。</w:t>
+      </w:r>
+    </w:p>
+    <w:p>
+      <w:pPr>
+        <w:spacing w:after="160" w:line="300"/>
+      </w:pPr>
+      <w:r>
+        <w:t xml:space="preserve">顾问团队为项目提供战略指导、行业资源与全球网络支持，特别强化了 Astarter 在 Cardano 生态中的根基与机构信用基础。</w:t>
       </w:r>
     </w:p>
     <w:p>
@@ -862,7 +1209,7 @@
         <w:spacing w:after="180" w:before="360"/>
       </w:pPr>
       <w:r>
-        <w:t xml:space="preserve">动态 04 — Web 4.0 AI Agent 经济叙事确立</w:t>
+        <w:t xml:space="preserve">动态 07 — 四层 AI 经济架构</w:t>
       </w:r>
     </w:p>
     <w:p>
@@ -889,7 +1236,7 @@
         <w:t xml:space="preserve">1. </w:t>
       </w:r>
       <w:r>
-        <w:t xml:space="preserve">Astarter 率先在中文媒体阐述 Web 4.0 AI Agent 经济完整论点</w:t>
+        <w:t xml:space="preserve">Astarter 公开四层 AI 经济架构 从基础设施到应用全栈覆盖</w:t>
       </w:r>
     </w:p>
     <w:p>
@@ -904,7 +1251,7 @@
         <w:t xml:space="preserve">2. </w:t>
       </w:r>
       <w:r>
-        <w:t xml:space="preserve">Web 4.0 不是叙事 是基础设施竞赛 | Astarter 完整阐述</w:t>
+        <w:t xml:space="preserve">应用层 + 智能体层 + 节点层 + 基础设施层 | Astarter 四层架构详解</w:t>
       </w:r>
     </w:p>
     <w:p>
@@ -919,7 +1266,7 @@
         <w:t xml:space="preserve">3. </w:t>
       </w:r>
       <w:r>
-        <w:t xml:space="preserve">2026 周期真正核心问题 谁为非人类经济行为者构建清算底层</w:t>
+        <w:t xml:space="preserve">L1 到 L4 完整堆栈 Astarter 如何构建端到端 AI 经济基础设施</w:t>
       </w:r>
     </w:p>
     <w:p>
@@ -939,112 +1286,15 @@
         <w:spacing w:after="160" w:line="300"/>
       </w:pPr>
       <w:r>
-        <w:t xml:space="preserve">Astarter 近期在 Cointime 平台发布深度长文，率先在中文加密媒体语境中系统阐述「Web 4.0 AI Agent 经济」完整论点。文章指出，2026 周期的核心叙事不再围绕哪条公链赢得流动性，而是聚焦于谁为第一代非人类经济行为者构建清算底层。文章引用 Messari、a16z、Delphi 等机构 2026 年研究，AI Agent 基础设施市场预计将从约 80 亿美元增长至 2030 年的 500 亿美元以上。</w:t>
-      </w:r>
-    </w:p>
-    <w:p>
-      <w:pPr>
-        <w:spacing w:after="80"/>
-      </w:pPr>
-      <w:r>
-        <w:rPr>
-          <w:rFonts w:ascii="Consolas" w:cs="Consolas" w:eastAsia="Consolas" w:hAnsi="Consolas"/>
-          <w:color w:val="888888"/>
-          <w:sz w:val="18"/>
-          <w:szCs w:val="18"/>
-        </w:rPr>
-        <w:t xml:space="preserve">astarter.io · @AstarterDefiHub</w:t>
-      </w:r>
-    </w:p>
-    <w:p>
-      <w:r>
-        <w:br w:type="page"/>
-      </w:r>
-    </w:p>
-    <w:p>
-      <w:pPr>
-        <w:pStyle w:val="Heading1"/>
-        <w:spacing w:after="180" w:before="360"/>
-      </w:pPr>
-      <w:r>
-        <w:t xml:space="preserve">动态 05 — DeFAI 类别先发占位</w:t>
-      </w:r>
-    </w:p>
-    <w:p>
-      <w:pPr>
-        <w:pStyle w:val="Heading3"/>
-        <w:spacing w:after="100" w:before="200"/>
-      </w:pPr>
-      <w:r>
-        <w:rPr>
-          <w:color w:val="6F00FF"/>
-        </w:rPr>
-        <w:t xml:space="preserve">标题备选</w:t>
-      </w:r>
-    </w:p>
-    <w:p>
-      <w:pPr>
-        <w:spacing w:after="60"/>
-      </w:pPr>
-      <w:r>
-        <w:rPr>
-          <w:b/>
-          <w:bCs/>
-        </w:rPr>
-        <w:t xml:space="preserve">1. </w:t>
-      </w:r>
-      <w:r>
-        <w:t xml:space="preserve">Astarter 锁定 DeFAI 清算层 在新兴类别中占据未被竞争对手填补的关键位置</w:t>
-      </w:r>
-    </w:p>
-    <w:p>
-      <w:pPr>
-        <w:spacing w:after="60"/>
-      </w:pPr>
-      <w:r>
-        <w:rPr>
-          <w:b/>
-          <w:bCs/>
-        </w:rPr>
-        <w:t xml:space="preserve">2. </w:t>
-      </w:r>
-      <w:r>
-        <w:t xml:space="preserve">AI Agent 经济四层架构中尚未被占据的关键位置：Astarter 的清算层占位</w:t>
-      </w:r>
-    </w:p>
-    <w:p>
-      <w:pPr>
-        <w:spacing w:after="60"/>
-      </w:pPr>
-      <w:r>
-        <w:rPr>
-          <w:b/>
-          <w:bCs/>
-        </w:rPr>
-        <w:t xml:space="preserve">3. </w:t>
-      </w:r>
-      <w:r>
-        <w:t xml:space="preserve">Olas、Virtuals、Fetch 之外，AI Agent 经济还有什么机会？答案是清算层</w:t>
-      </w:r>
-    </w:p>
-    <w:p>
-      <w:pPr>
-        <w:pStyle w:val="Heading3"/>
-        <w:spacing w:after="100" w:before="200"/>
-      </w:pPr>
-      <w:r>
-        <w:rPr>
-          <w:color w:val="6F00FF"/>
-        </w:rPr>
-        <w:t xml:space="preserve">短稿</w:t>
-      </w:r>
-    </w:p>
-    <w:p>
-      <w:pPr>
-        <w:spacing w:after="160" w:line="300"/>
-      </w:pPr>
-      <w:r>
-        <w:t xml:space="preserve">随着 DeFAI（去中心化金融 × 自主 AI 执行）类别在 2026 年迅速崛起，Astarter 已锁定该类别中尚未被竞争对手完整占据的「清算层」位置。Astarter 是面向 Web4 构建的去中心化 AI + DeFi (DeFAI) 基础设施，旨在打造一个可由 AI 执行的经济系统，使自主 AI Agent 能够在链上独立完成交易执行、策略优化以及实时数据处理。业内对比分析显示，AI Agent 经济四层架构中前三层已有 Olas、Virtuals、Fetch.ai 等多家头部项目布局，唯独「清算层」长期空缺，Astarter 凭借自 2021 年起持续运行的四产品 DeFi 堆栈成为目前唯一公开占位的代表项目之一。</w:t>
+        <w:t xml:space="preserve">Astarter 公开其「四层 AI 经济架构」，每一层都建立在下一层之上：L4 应用层（AI DEX、预测市场、智能体应用商店）、L3 智能体层（自主 AI 智能体在执行交易、策略和预测的同时产生收入）、L2 节点层（ABox DePIN 节点提供算力与执行）、L1 基础设施层（高性能区块链 + AI 原生执行环境）。</w:t>
+      </w:r>
+    </w:p>
+    <w:p>
+      <w:pPr>
+        <w:spacing w:after="160" w:line="300"/>
+      </w:pPr>
+      <w:r>
+        <w:t xml:space="preserve">L1 是基础，L4 是用户直接接触的层级。这一架构使 Astarter 成为 AI Agent 经济类别中少数从底层基础设施到上层应用提供完整端到端方案的项目之一。</w:t>
       </w:r>
     </w:p>
     <w:p>
@@ -1057,7 +1307,7 @@
           <wp:inline distT="0" distB="0" distL="0" distR="0">
             <wp:extent cx="3048000" cy="3048000"/>
             <wp:effectExtent t="0" r="0" b="0" l="0"/>
-            <wp:docPr id="1" name="dynamic-04-defai-positioning.png" descr="dynamic-04-defai-positioning.png" title="dynamic-04-defai-positioning.png"/>
+            <wp:docPr id="1" name="dynamic-09-three-layer.png" descr="dynamic-09-three-layer.png" title="dynamic-09-three-layer.png"/>
             <wp:cNvGraphicFramePr>
               <a:graphicFrameLocks xmlns:a="http://schemas.openxmlformats.org/drawingml/2006/main" noChangeAspect="1"/>
             </wp:cNvGraphicFramePr>
@@ -1118,7 +1368,7 @@
         <w:spacing w:after="180" w:before="360"/>
       </w:pPr>
       <w:r>
-        <w:t xml:space="preserve">动态 06 — 四产品 DeFi 堆栈重新定位</w:t>
+        <w:t xml:space="preserve">动态 08 — 核心应用场景矩阵</w:t>
       </w:r>
     </w:p>
     <w:p>
@@ -1145,7 +1395,7 @@
         <w:t xml:space="preserve">1. </w:t>
       </w:r>
       <w:r>
-        <w:t xml:space="preserve">Astarter 四产品 DeFi 堆栈集体重新定位为 AI Agent 经济金融原语层</w:t>
+        <w:t xml:space="preserve">Astarter 公开核心应用场景 AI DEX + 预测市场 + 智能体应用商店 + 数据市场</w:t>
       </w:r>
     </w:p>
     <w:p>
@@ -1160,7 +1410,7 @@
         <w:t xml:space="preserve">2. </w:t>
       </w:r>
       <w:r>
-        <w:t xml:space="preserve">不是转型 是识别 | Astarter 四产品堆栈重新定位详解</w:t>
+        <w:t xml:space="preserve">AI Agent 经济四大用例 | Astarter 应用矩阵详解</w:t>
       </w:r>
     </w:p>
     <w:p>
@@ -1175,7 +1425,7 @@
         <w:t xml:space="preserve">3. </w:t>
       </w:r>
       <w:r>
-        <w:t xml:space="preserve">同样的产品 更大的市场 | Astarter 战略重新定位逻辑解析</w:t>
+        <w:t xml:space="preserve">从 AI DEX 到数据市场 Astarter 如何承接自主 AI 智能体的真实需求</w:t>
       </w:r>
     </w:p>
     <w:p>
@@ -1195,7 +1445,15 @@
         <w:spacing w:after="160" w:line="300"/>
       </w:pPr>
       <w:r>
-        <w:t xml:space="preserve">Astarter 旗下四款产品——Launchpad、DEX、Money Market、Tech Service Platform——正在集体完成战略重新定位，从传统 DeFi 基础设施转向自主 AI Agent 经济的金融原语层。本次重新定位并非产品重构，而是将既有四年生产级堆栈重新指向更大的 AI Agent 市场——Agent 与人类用户在金融原语需求上存在结构性差异，现有 DeFi 难以直接服务。Astarter 强调本次定位调整为「识别而非转型」——同样的四款产品，更大的可寻址市场。</w:t>
+        <w:t xml:space="preserve">Astarter 公开核心应用场景矩阵，覆盖 AI Agent 经济的四大用例：AI DEX（智能体执行交易、做市与套利）、预测市场（分析数据加入预测市场）、Agent Marketplace 智能体市场（用户购买/部署/租赁 AI 智能体）、数据市场（智能体生成、处理与交易数据）。</w:t>
+      </w:r>
+    </w:p>
+    <w:p>
+      <w:pPr>
+        <w:spacing w:after="160" w:line="300"/>
+      </w:pPr>
+      <w:r>
+        <w:t xml:space="preserve">应用矩阵的多元化覆盖使 Astarter 能够承接自主 AI 智能体在不同场景的真实需求，并通过经济飞轮回流网络价值。</w:t>
       </w:r>
     </w:p>
     <w:p>
@@ -1223,7 +1481,7 @@
         <w:spacing w:after="180" w:before="360"/>
       </w:pPr>
       <w:r>
-        <w:t xml:space="preserve">动态 07 — 多链扩展路线图释放信号</w:t>
+        <w:t xml:space="preserve">动态 09 — 经济飞轮模型</w:t>
       </w:r>
     </w:p>
     <w:p>
@@ -1250,7 +1508,7 @@
         <w:t xml:space="preserve">1. </w:t>
       </w:r>
       <w:r>
-        <w:t xml:space="preserve">Astarter 释放多链扩展路线图信号 携手 ENI 公链建立跨链桥</w:t>
+        <w:t xml:space="preserve">Astarter 经济飞轮模型公开 应用 → 智能体 → 节点 → 价值的自我强化循环</w:t>
       </w:r>
     </w:p>
     <w:p>
@@ -1265,7 +1523,7 @@
         <w:t xml:space="preserve">2. </w:t>
       </w:r>
       <w:r>
-        <w:t xml:space="preserve">跨链是 AI Agent 经济的必选项 | Astarter 多链战略信号解读</w:t>
+        <w:t xml:space="preserve">四阶段经济飞轮 | Astarter 如何让每次执行都强化整个网络</w:t>
       </w:r>
     </w:p>
     <w:p>
@@ -1280,7 +1538,7 @@
         <w:t xml:space="preserve">3. </w:t>
       </w:r>
       <w:r>
-        <w:t xml:space="preserve">从 Cardano 到全链 | Astarter 基础设施跨链扩展规划</w:t>
+        <w:t xml:space="preserve">On-Chain Economic Flywheel | Astarter 长期可持续性的结构性基础</w:t>
       </w:r>
     </w:p>
     <w:p>
@@ -1300,7 +1558,15 @@
         <w:spacing w:after="160" w:line="300"/>
       </w:pPr>
       <w:r>
-        <w:t xml:space="preserve">Cardano 生态基础设施项目 Astarter 已释放清晰的多链扩展路线图信号——通过与 ENI 公链战略合作建立跨链流动性桥，逐步将其清算层基础设施延伸至多个主流公链生态。团队认为，AI Agent 经济与 DePIN 网络本质上跨链运行，仅锚定单一公链的执行层在结构上受限。多链扩展是 Astarter 触达全部 AI Agent 经济活动的关键一步。Cardano 仍将作为基础锚链保留。</w:t>
+        <w:t xml:space="preserve">Astarter 公开「链上经济飞轮」四阶段循环模型：(1) 需求 - 应用层：DEX、预测市场、数据市场等应用产生真实需求；(2) 生产者 - AI 智能体：执行交易、预测、分析等任务；(3) 基础设施 - ABox 节点：提供算力、部署与执行环境；(4) 价值 - 收入与激励：执行费用、交易利润、协议收入分享回流至节点与网络。</w:t>
+      </w:r>
+    </w:p>
+    <w:p>
+      <w:pPr>
+        <w:spacing w:after="160" w:line="300"/>
+      </w:pPr>
+      <w:r>
+        <w:t xml:space="preserve">每一次执行都强化整个网络，循环复利累积。这是 Astarter 长期可持续性的结构性基础。</w:t>
       </w:r>
     </w:p>
     <w:p>
@@ -1328,7 +1594,7 @@
         <w:spacing w:after="180" w:before="360"/>
       </w:pPr>
       <w:r>
-        <w:t xml:space="preserve">动态 08 — OKX Ventures × EMURGO 共同领投</w:t>
+        <w:t xml:space="preserve">动态 10 — Astarter Grant Program 启动</w:t>
       </w:r>
     </w:p>
     <w:p>
@@ -1355,7 +1621,7 @@
         <w:t xml:space="preserve">1. </w:t>
       </w:r>
       <w:r>
-        <w:t xml:space="preserve">Astarter 获 OKX Ventures 与 EMURGO 共同领投 同时得到 MH Ventures、Adaverse 等机构支持</w:t>
+        <w:t xml:space="preserve">Astarter Grant Program 即将启动 邀请开发者共建 Web4 AI Agent 生态</w:t>
       </w:r>
     </w:p>
     <w:p>
@@ -1370,7 +1636,7 @@
         <w:t xml:space="preserve">2. </w:t>
       </w:r>
       <w:r>
-        <w:t xml:space="preserve">重磅资本结构 | OKX Ventures + EMURGO 联手押注 Astarter Web4 AI Agent 基础设施</w:t>
+        <w:t xml:space="preserve">重磅 | Astarter 2026 Q3 Grant Program 启动 加速生态建设</w:t>
       </w:r>
     </w:p>
     <w:p>
@@ -1385,7 +1651,7 @@
         <w:t xml:space="preserve">3. </w:t>
       </w:r>
       <w:r>
-        <w:t xml:space="preserve">OKX Ventures 与 Cardano 基石机构 EMURGO 共同押注 Astarter — 解读多层资本结构</w:t>
+        <w:t xml:space="preserve">Astarter 开放生态资助计划 与全球 Web4 AI Agent 开发者共建</w:t>
       </w:r>
     </w:p>
     <w:p>
@@ -1405,15 +1671,128 @@
         <w:spacing w:after="160" w:line="300"/>
       </w:pPr>
       <w:r>
-        <w:t xml:space="preserve">面向 Web4 构建的去中心化 AI + DeFi (DeFAI) 基础设施项目 Astarter 已获得 OKX Ventures 与 EMURGO 共同领投，同时得到 MH Ventures、Adaverse 等机构支持，构建覆盖风险投资、交易所生态与战略合作伙伴的多层资本结构。其中 EMURGO 作为 Cardano 协议三大基石机构之一持续支持项目自 2021 年起的生态发展；OKX Ventures 的加入标志着 Astarter 战略定位获得头部交易所风投机构的认可。多层资本结构为 Astarter 在 AI Agent 基础设施竞争中提供了战略资源与生态背书。</w:t>
-      </w:r>
-    </w:p>
-    <w:p>
-      <w:pPr>
-        <w:spacing w:after="160" w:line="300"/>
-      </w:pPr>
-      <w:r>
-        <w:t xml:space="preserve">📰 详细报道：https://cn.cointime.ai/news/astarter-web4-x-defai-ji-chu-she-shi-ping-tai-huo-okx-ventures-yu-emurgo-shuang-ling-tou-71920</w:t>
+        <w:t xml:space="preserve">作为 2026 Q3 路线图的重要组成部分，Astarter Grant Program 即将启动。该计划将作为项目生态扩展的关键加速器，邀请全球 Web4 AI Agent 开发者、ABox 节点运营者、应用构建者参与生态建设。</w:t>
+      </w:r>
+    </w:p>
+    <w:p>
+      <w:pPr>
+        <w:spacing w:after="160" w:line="300"/>
+      </w:pPr>
+      <w:r>
+        <w:t xml:space="preserve">Grant Program 与 Mainnet 主网上线、TGE 代币生成事件、ABox 节点计划同期推进，构成 Astarter 在 2026 Q3 的完整生态启动组合。具体申请通道、资助方向、首批资助项目名单将在后续公告中公布。</w:t>
+      </w:r>
+    </w:p>
+    <w:p>
+      <w:pPr>
+        <w:spacing w:after="80"/>
+      </w:pPr>
+      <w:r>
+        <w:rPr>
+          <w:rFonts w:ascii="Consolas" w:cs="Consolas" w:eastAsia="Consolas" w:hAnsi="Consolas"/>
+          <w:color w:val="888888"/>
+          <w:sz w:val="18"/>
+          <w:szCs w:val="18"/>
+        </w:rPr>
+        <w:t xml:space="preserve">astarter.io · @AstarterDefiHub</w:t>
+      </w:r>
+    </w:p>
+    <w:p>
+      <w:r>
+        <w:br w:type="page"/>
+      </w:r>
+    </w:p>
+    <w:p>
+      <w:pPr>
+        <w:pStyle w:val="Heading1"/>
+        <w:spacing w:after="180" w:before="360"/>
+      </w:pPr>
+      <w:r>
+        <w:t xml:space="preserve">动态 11 — Cointime 长文重磅上线</w:t>
+      </w:r>
+    </w:p>
+    <w:p>
+      <w:pPr>
+        <w:pStyle w:val="Heading3"/>
+        <w:spacing w:after="100" w:before="200"/>
+      </w:pPr>
+      <w:r>
+        <w:rPr>
+          <w:color w:val="6F00FF"/>
+        </w:rPr>
+        <w:t xml:space="preserve">标题备选</w:t>
+      </w:r>
+    </w:p>
+    <w:p>
+      <w:pPr>
+        <w:spacing w:after="60"/>
+      </w:pPr>
+      <w:r>
+        <w:rPr>
+          <w:b/>
+          <w:bCs/>
+        </w:rPr>
+        <w:t xml:space="preserve">1. </w:t>
+      </w:r>
+      <w:r>
+        <w:t xml:space="preserve">Astarter Web4 × DeFAI 基础设施平台获 OKX Ventures 与 EMURGO 双领投 — Cointime 长文上线</w:t>
+      </w:r>
+    </w:p>
+    <w:p>
+      <w:pPr>
+        <w:spacing w:after="60"/>
+      </w:pPr>
+      <w:r>
+        <w:rPr>
+          <w:b/>
+          <w:bCs/>
+        </w:rPr>
+        <w:t xml:space="preserve">2. </w:t>
+      </w:r>
+      <w:r>
+        <w:t xml:space="preserve">重磅 | Cointime 上线 Astarter 万字长文 完整阐述 Web4 AI DePIN 基础设施</w:t>
+      </w:r>
+    </w:p>
+    <w:p>
+      <w:pPr>
+        <w:spacing w:after="60"/>
+      </w:pPr>
+      <w:r>
+        <w:rPr>
+          <w:b/>
+          <w:bCs/>
+        </w:rPr>
+        <w:t xml:space="preserve">3. </w:t>
+      </w:r>
+      <w:r>
+        <w:t xml:space="preserve">Cardano 生态首个 Web4 AI DePIN 基础设施完整论点 Astarter 长文上线 Cointime</w:t>
+      </w:r>
+    </w:p>
+    <w:p>
+      <w:pPr>
+        <w:pStyle w:val="Heading3"/>
+        <w:spacing w:after="100" w:before="200"/>
+      </w:pPr>
+      <w:r>
+        <w:rPr>
+          <w:color w:val="6F00FF"/>
+        </w:rPr>
+        <w:t xml:space="preserve">短稿</w:t>
+      </w:r>
+    </w:p>
+    <w:p>
+      <w:pPr>
+        <w:spacing w:after="160" w:line="300"/>
+      </w:pPr>
+      <w:r>
+        <w:t xml:space="preserve">2026 年 5 月 24 日，Cardano 生态基础设施平台 Astarter 联合头部加密媒体 Cointime 正式发布深度长文《Astarter Web4 × DeFAI 基础设施平台 获 OKX Ventures 与 EMURGO 双领投》，系统阐述项目作为 Web4 AI DePIN 基础设施的战略定位、资本结构与执行路径。文章首次完整呈现 Astarter 的四层 AI 经济架构、ABox 节点产品方案、$AA 代币经济模型与 2026 Q3 路线图。</w:t>
+      </w:r>
+    </w:p>
+    <w:p>
+      <w:pPr>
+        <w:spacing w:after="160" w:line="300"/>
+      </w:pPr>
+      <w:r>
+        <w:t xml:space="preserve">📰 完整长文：https://cn.cointime.ai/news/astarter-web4-x-defai-ji-chu-she-shi-ping-tai-huo-okx-ventures-yu-emurgo-shuang-ling-tou-71920</w:t>
       </w:r>
     </w:p>
     <w:p>
@@ -1424,9 +1803,9 @@
       <w:r>
         <w:drawing>
           <wp:inline distT="0" distB="0" distL="0" distR="0">
-            <wp:extent cx="4572000" cy="1857375"/>
+            <wp:extent cx="3048000" cy="3048000"/>
             <wp:effectExtent t="0" r="0" b="0" l="0"/>
-            <wp:docPr id="1" name="banner-investors-1180x480.png" descr="banner-investors-1180x480.png" title="banner-investors-1180x480.png"/>
+            <wp:docPr id="1" name="dynamic-01-cointime-launch.png" descr="dynamic-01-cointime-launch.png" title="dynamic-01-cointime-launch.png"/>
             <wp:cNvGraphicFramePr>
               <a:graphicFrameLocks xmlns:a="http://schemas.openxmlformats.org/drawingml/2006/main" noChangeAspect="1"/>
             </wp:cNvGraphicFramePr>
@@ -1449,7 +1828,7 @@
                   <pic:spPr bwMode="auto">
                     <a:xfrm>
                       <a:off x="0" y="0"/>
-                      <a:ext cx="4572000" cy="1857375"/>
+                      <a:ext cx="3048000" cy="3048000"/>
                     </a:xfrm>
                     <a:prstGeom prst="rect">
                       <a:avLst/>
@@ -1487,7 +1866,7 @@
         <w:spacing w:after="180" w:before="360"/>
       </w:pPr>
       <w:r>
-        <w:t xml:space="preserve">动态 09 — 三层融合架构</w:t>
+        <w:t xml:space="preserve">动态 12 — Cointime × Astarter Twitter Space (5/12)</w:t>
       </w:r>
     </w:p>
     <w:p>
@@ -1514,7 +1893,7 @@
         <w:t xml:space="preserve">1. </w:t>
       </w:r>
       <w:r>
-        <w:t xml:space="preserve">Astarter 公开三层融合架构 协调 AI Agent + DePIN + DeFAI 三大趋势</w:t>
+        <w:t xml:space="preserve">Cointime × Astarter Twitter Space 集结 AI Agent × Web4 多项目深度对话</w:t>
       </w:r>
     </w:p>
     <w:p>
@@ -1529,7 +1908,7 @@
         <w:t xml:space="preserve">2. </w:t>
       </w:r>
       <w:r>
-        <w:t xml:space="preserve">AI Agent + DePIN + DeFAI | Astarter 三层融合架构详解</w:t>
+        <w:t xml:space="preserve">AI Agents as the Autonomous Execution Layer of Web4 — Cointime × Astarter 联合 AMA 全程回顾</w:t>
       </w:r>
     </w:p>
     <w:p>
@@ -1544,7 +1923,7 @@
         <w:t xml:space="preserve">3. </w:t>
       </w:r>
       <w:r>
-        <w:t xml:space="preserve">大多数项目覆盖一层 Astarter 承诺覆盖三层</w:t>
+        <w:t xml:space="preserve">5/12 Cointime × Astarter Space：多项目联合探讨 AI Agent 演进路径</w:t>
       </w:r>
     </w:p>
     <w:p>
@@ -1564,7 +1943,144 @@
         <w:spacing w:after="160" w:line="300"/>
       </w:pPr>
       <w:r>
-        <w:t xml:space="preserve">Astarter 在近期公开材料中正式发布「三层融合架构」——将 AI Agent（行为者）、DePIN（算力底层）与 DeFAI（金融层）三大独立趋势在统一堆栈中协调。项目自身将该架构概括为：「Astarter 正在构建自主 AI Agent 经济的基础设施——融合 AI Agent、DePIN 与 DeFAI。」业内分析认为，该三层架构是 AI Agent 经济领域少数公开承诺覆盖全部三层的项目方案。大多数同类项目仅覆盖其中一层，Astarter 通过自身堆栈 + 战略联盟矩阵（UXLINK、AntFun、SumPlus、PayGo、ENI）的组合方式实现三层完整覆盖。</w:t>
+        <w:t xml:space="preserve">2026 年 5 月 12 日 20:00 (UTC+8)，Cointime 与 Astarter 联合举办 Twitter Space，主题为「AI Agents as the Autonomous Execution Layer of Web4」。本次 Space 由 Ayelle (@ayelleley) 主持，集结多位 AI Agent × Web4 领域的关键项目代表：Batman（AstarterDefiHub）、Jakob（SumPlusReal 联合创始人）、Sofija（BrcToTheMoon CMO）、Austin（Global Ambassador）、Darkan（OriginsNetwork 核心团队）。</w:t>
+      </w:r>
+    </w:p>
+    <w:p>
+      <w:pPr>
+        <w:spacing w:after="160" w:line="300"/>
+      </w:pPr>
+      <w:r>
+        <w:t xml:space="preserve">讨论聚焦三大议题：AI Agent × Web4 领域的项目侧重、AI Agent 首先颠覆的领域（DeFi / 交易 / 链上资产管理）、未来 6-12 个月最具行动力的机会。</w:t>
+      </w:r>
+    </w:p>
+    <w:p>
+      <w:pPr>
+        <w:spacing w:after="160" w:line="300"/>
+      </w:pPr>
+      <w:r>
+        <w:t xml:space="preserve">🔗 Space 回放：https://x.com/i/spaces/1akbd/i/spaces/1KbdbAWnBkJX</w:t>
+      </w:r>
+    </w:p>
+    <w:p>
+      <w:pPr>
+        <w:spacing w:after="80"/>
+      </w:pPr>
+      <w:r>
+        <w:rPr>
+          <w:rFonts w:ascii="Consolas" w:cs="Consolas" w:eastAsia="Consolas" w:hAnsi="Consolas"/>
+          <w:color w:val="888888"/>
+          <w:sz w:val="18"/>
+          <w:szCs w:val="18"/>
+        </w:rPr>
+        <w:t xml:space="preserve">astarter.io · @AstarterDefiHub</w:t>
+      </w:r>
+    </w:p>
+    <w:p>
+      <w:r>
+        <w:br w:type="page"/>
+      </w:r>
+    </w:p>
+    <w:p>
+      <w:pPr>
+        <w:pStyle w:val="Heading1"/>
+        <w:spacing w:after="180" w:before="360"/>
+      </w:pPr>
+      <w:r>
+        <w:t xml:space="preserve">动态 13 — Astarter × UXLINK 战略合作</w:t>
+      </w:r>
+    </w:p>
+    <w:p>
+      <w:pPr>
+        <w:pStyle w:val="Heading3"/>
+        <w:spacing w:after="100" w:before="200"/>
+      </w:pPr>
+      <w:r>
+        <w:rPr>
+          <w:color w:val="6F00FF"/>
+        </w:rPr>
+        <w:t xml:space="preserve">标题备选</w:t>
+      </w:r>
+    </w:p>
+    <w:p>
+      <w:pPr>
+        <w:spacing w:after="60"/>
+      </w:pPr>
+      <w:r>
+        <w:rPr>
+          <w:b/>
+          <w:bCs/>
+        </w:rPr>
+        <w:t xml:space="preserve">1. </w:t>
+      </w:r>
+      <w:r>
+        <w:t xml:space="preserve">Astarter 与 UXLINK 达成战略合作 推动 Web4 AI Agent 经济社交化采用</w:t>
+      </w:r>
+    </w:p>
+    <w:p>
+      <w:pPr>
+        <w:spacing w:after="60"/>
+      </w:pPr>
+      <w:r>
+        <w:rPr>
+          <w:b/>
+          <w:bCs/>
+        </w:rPr>
+        <w:t xml:space="preserve">2. </w:t>
+      </w:r>
+      <w:r>
+        <w:t xml:space="preserve">重磅合作 | Astarter × UXLINK 整合 AI 原生基础设施与社交驱动生态</w:t>
+      </w:r>
+    </w:p>
+    <w:p>
+      <w:pPr>
+        <w:spacing w:after="60"/>
+      </w:pPr>
+      <w:r>
+        <w:rPr>
+          <w:b/>
+          <w:bCs/>
+        </w:rPr>
+        <w:t xml:space="preserve">3. </w:t>
+      </w:r>
+      <w:r>
+        <w:t xml:space="preserve">AI Agent 需要网络 互联网需要人 — Astarter × UXLINK 共探 Web3 下一阶段进化</w:t>
+      </w:r>
+    </w:p>
+    <w:p>
+      <w:pPr>
+        <w:pStyle w:val="Heading3"/>
+        <w:spacing w:after="100" w:before="200"/>
+      </w:pPr>
+      <w:r>
+        <w:rPr>
+          <w:color w:val="6F00FF"/>
+        </w:rPr>
+        <w:t xml:space="preserve">短稿</w:t>
+      </w:r>
+    </w:p>
+    <w:p>
+      <w:pPr>
+        <w:spacing w:after="160" w:line="300"/>
+      </w:pPr>
+      <w:r>
+        <w:t xml:space="preserve">Astarter 宣布与 Web3 头部社交平台 UXLINK 建立战略合作。Astarter 团队对该合作的官方表述为：「Astarter 正在构建自主 AI Agent 经济的基础设施 —— 融合 AI Agent、DePIN 与 DeFAI，使自主 AI 系统能够在链上运行、协调并创造真实经济价值。」</w:t>
+      </w:r>
+    </w:p>
+    <w:p>
+      <w:pPr>
+        <w:spacing w:after="160" w:line="300"/>
+      </w:pPr>
+      <w:r>
+        <w:t xml:space="preserve">UXLINK 作为全球领先的 Web3 社交平台之一，通过其强大的社交增长层推动大规模社交采用，连接全球用户、社区与构建者。双方将共同探索如何整合 AI 原生基础设施与社交驱动生态，加速 Web3 参与、自主协调与链上增长的下一阶段进化。</w:t>
+      </w:r>
+    </w:p>
+    <w:p>
+      <w:pPr>
+        <w:spacing w:after="160" w:line="300"/>
+      </w:pPr>
+      <w:r>
+        <w:t xml:space="preserve">「AI Agent 需要网络。互联网需要人。未来将是自主——而且是社交的。」</w:t>
       </w:r>
     </w:p>
     <w:p>
@@ -1577,7 +2093,7 @@
           <wp:inline distT="0" distB="0" distL="0" distR="0">
             <wp:extent cx="3048000" cy="3048000"/>
             <wp:effectExtent t="0" r="0" b="0" l="0"/>
-            <wp:docPr id="1" name="dynamic-09-three-layer.png" descr="dynamic-09-three-layer.png" title="dynamic-09-three-layer.png"/>
+            <wp:docPr id="1" name="dynamic-02-uxlink-alliance.png" descr="dynamic-02-uxlink-alliance.png" title="dynamic-02-uxlink-alliance.png"/>
             <wp:cNvGraphicFramePr>
               <a:graphicFrameLocks xmlns:a="http://schemas.openxmlformats.org/drawingml/2006/main" noChangeAspect="1"/>
             </wp:cNvGraphicFramePr>
@@ -1638,7 +2154,7 @@
         <w:spacing w:after="180" w:before="360"/>
       </w:pPr>
       <w:r>
-        <w:t xml:space="preserve">动态 10 — Cardano 生态 AI 基础设施代表项目</w:t>
+        <w:t xml:space="preserve">动态 14 — Astarter × AntFun 战略合作（社交 DEX）</w:t>
       </w:r>
     </w:p>
     <w:p>
@@ -1665,7 +2181,7 @@
         <w:t xml:space="preserve">1. </w:t>
       </w:r>
       <w:r>
-        <w:t xml:space="preserve">Astarter 成为 Cardano 生态 AI 基础设施代表性项目</w:t>
+        <w:t xml:space="preserve">Astarter 与下一代社交 DEX AntFun 达成战略合作 共建智能化社交链上交易生态</w:t>
       </w:r>
     </w:p>
     <w:p>
@@ -1680,7 +2196,7 @@
         <w:t xml:space="preserve">2. </w:t>
       </w:r>
       <w:r>
-        <w:t xml:space="preserve">当人们谈论「Cardano 的 AI 故事」时 应该谈论 Astarter</w:t>
+        <w:t xml:space="preserve">重磅 | Astarter × AntFun：AI 原生 DeFAI × 超低费率社交 DEX × AI 智能交易工具</w:t>
       </w:r>
     </w:p>
     <w:p>
@@ -1695,7 +2211,7 @@
         <w:t xml:space="preserve">3. </w:t>
       </w:r>
       <w:r>
-        <w:t xml:space="preserve">Cardano + AI = Astarter | 完整定位档案</w:t>
+        <w:t xml:space="preserve">DeFi × AI Agent × Social | Astarter × AntFun 共同推动 DeFi 下一阶段</w:t>
       </w:r>
     </w:p>
     <w:p>
@@ -1715,7 +2231,7 @@
         <w:spacing w:after="160" w:line="300"/>
       </w:pPr>
       <w:r>
-        <w:t xml:space="preserve">随着 Cardano 生态在 2026 年加速布局 AI 与 Web4 方向，Astarter 凭借其完整的四产品 DeFi 堆栈、OKX Ventures + EMURGO 共同领投的资本结构以及在 AI Agent 经济的清晰定位，已成为 Cardano 生态 AI 基础设施的代表性项目之一。业内观察认为，在 Cardano 中文社区与开发者生态中，Astarter 是目前公开布局 AI Agent 基础设施完整堆栈的代表项目方。该定位为 Cardano 在 AI × Crypto 大趋势中提供了具体的生态承载点。</w:t>
+        <w:t xml:space="preserve">Astarter 宣布与下一代社交 DEX AntFun (@ant_fun_trade) 达成战略合作。Astarter 的 AI 原生基础设施与自主 AI Agent 执行能力，结合 AntFun 的超低费率社交 DEX 与 AI 智能交易工具，将为用户打造更智能、更高效、更具社交属性的链上交易与质押生态。双方将共同推动 DeFi × AI Agent × Social 的下一阶段，期待后续联合公关与生态整合的细节公布。</w:t>
       </w:r>
     </w:p>
     <w:p>
@@ -1743,7 +2259,7 @@
         <w:spacing w:after="180" w:before="360"/>
       </w:pPr>
       <w:r>
-        <w:t xml:space="preserve">动态 11 — 6-12 个月路线图：ABox 节点部署 + AI 应用市场</w:t>
+        <w:t xml:space="preserve">动态 15 — Astarter × SumPlus 战略合作（MCP DeFi 数据层）</w:t>
       </w:r>
     </w:p>
     <w:p>
@@ -1770,7 +2286,7 @@
         <w:t xml:space="preserve">1. </w:t>
       </w:r>
       <w:r>
-        <w:t xml:space="preserve">Astarter 未来 6-12 个月双重路线图释放：ABox 节点全球部署 + AI 应用市场推出</w:t>
+        <w:t xml:space="preserve">Astarter × SumPlus 战略合作：AI Agent 通过 MCP 一键调用全球顶级 DeFi 实时数据</w:t>
       </w:r>
     </w:p>
     <w:p>
@@ -1785,7 +2301,7 @@
         <w:t xml:space="preserve">2. </w:t>
       </w:r>
       <w:r>
-        <w:t xml:space="preserve">ABox + AI Application Marketplace | Astarter 6-12 个月核心执行优先级公布</w:t>
+        <w:t xml:space="preserve">DeFi Data Layer × AI Agent Execution Layer | Astarter × SumPlus 共建 Web4 去中心化金融操作系统</w:t>
       </w:r>
     </w:p>
     <w:p>
@@ -1800,7 +2316,7 @@
         <w:t xml:space="preserve">3. </w:t>
       </w:r>
       <w:r>
-        <w:t xml:space="preserve">从基础设施到应用层 | Astarter 路线图协同推进 ABox 节点与 AI 应用市场</w:t>
+        <w:t xml:space="preserve">重磅 | AI Agent 数据视野 + 链上执行能力 — Astarter 与 SumPlus 完成关键基础设施握手</w:t>
       </w:r>
     </w:p>
     <w:p>
@@ -1820,77 +2336,23 @@
         <w:spacing w:after="160" w:line="300"/>
       </w:pPr>
       <w:r>
-        <w:t xml:space="preserve">面向 Web4 自主 AI Agent 生态的基础设施项目 Astarter 已释放明确的 6-12 个月双重路线图：</w:t>
-      </w:r>
-    </w:p>
-    <w:p>
-      <w:pPr>
-        <w:spacing w:after="160" w:line="300"/>
-      </w:pPr>
-      <w:r>
-        <w:t xml:space="preserve">第一，全球 ABox 节点部署加速——ABox 节点是 Astarter 物理节点层的核心基础设施，承担 AI Agent 执行、算力调度与跨地域协调的底层任务。节点全球化部署是触达跨地域 AI Agent 经济活动的关键一步。</w:t>
-      </w:r>
-    </w:p>
-    <w:p>
-      <w:pPr>
-        <w:spacing w:after="160" w:line="300"/>
-      </w:pPr>
-      <w:r>
-        <w:t xml:space="preserve">第二，AI 应用市场（AI Application Marketplace）即将推出——为 Web4 自主智能代理生态提供更坚实的底层支撑。</w:t>
-      </w:r>
-    </w:p>
-    <w:p>
-      <w:pPr>
-        <w:spacing w:after="160" w:line="300"/>
-      </w:pPr>
-      <w:r>
-        <w:t xml:space="preserve">两者共同构成 Astarter 在 6-12 个月窗口内的核心执行优先级。具体部署区域、推出时间、首批入驻应用名单及开发者接入路径将在后续公告中公布。</w:t>
-      </w:r>
-    </w:p>
-    <w:p>
-      <w:pPr>
-        <w:spacing w:after="100" w:before="100"/>
-        <w:jc w:val="center"/>
-      </w:pPr>
-      <w:r>
-        <w:drawing>
-          <wp:inline distT="0" distB="0" distL="0" distR="0">
-            <wp:extent cx="4572000" cy="1857375"/>
-            <wp:effectExtent t="0" r="0" b="0" l="0"/>
-            <wp:docPr id="1" name="banner-roadmap-1180x480.png" descr="banner-roadmap-1180x480.png" title="banner-roadmap-1180x480.png"/>
-            <wp:cNvGraphicFramePr>
-              <a:graphicFrameLocks xmlns:a="http://schemas.openxmlformats.org/drawingml/2006/main" noChangeAspect="1"/>
-            </wp:cNvGraphicFramePr>
-            <a:graphic xmlns:a="http://schemas.openxmlformats.org/drawingml/2006/main">
-              <a:graphicData uri="http://schemas.openxmlformats.org/drawingml/2006/picture">
-                <pic:pic xmlns:pic="http://schemas.openxmlformats.org/drawingml/2006/picture">
-                  <pic:nvPicPr>
-                    <pic:cNvPr id="0" name="" descr=""/>
-                    <pic:cNvPicPr>
-                      <a:picLocks noChangeAspect="1" noChangeArrowheads="1"/>
-                    </pic:cNvPicPr>
-                  </pic:nvPicPr>
-                  <pic:blipFill>
-                    <a:blip r:embed="rId15" cstate="none"/>
-                    <a:srcRect/>
-                    <a:stretch>
-                      <a:fillRect/>
-                    </a:stretch>
-                  </pic:blipFill>
-                  <pic:spPr bwMode="auto">
-                    <a:xfrm>
-                      <a:off x="0" y="0"/>
-                      <a:ext cx="4572000" cy="1857375"/>
-                    </a:xfrm>
-                    <a:prstGeom prst="rect">
-                      <a:avLst/>
-                    </a:prstGeom>
-                  </pic:spPr>
-                </pic:pic>
-              </a:graphicData>
-            </a:graphic>
-          </wp:inline>
-        </w:drawing>
+        <w:t xml:space="preserve">Astarter 宣布与 SumPlus (@SumPlusReal) 达成战略合作。通过 MCP（Model Context Protocol），AI Agent 现在可以一键调用全球顶级权威 DeFi 实时数据：TVL、协议核心指标、异构链生态、跨链全景分析全面覆盖。</w:t>
+      </w:r>
+    </w:p>
+    <w:p>
+      <w:pPr>
+        <w:spacing w:after="160" w:line="300"/>
+      </w:pPr>
+      <w:r>
+        <w:t xml:space="preserve">这正是 Astarter 长期布局的 AI 原生金融基础设施 —— 为链上自主代理补齐核心的「数据视野」与「链上执行能力」，真正实现链上 7×24 小时不间断捕捉、创造真实价值。</w:t>
+      </w:r>
+    </w:p>
+    <w:p>
+      <w:pPr>
+        <w:spacing w:after="160" w:line="300"/>
+      </w:pPr>
+      <w:r>
+        <w:t xml:space="preserve">DeFi Data Layer × AI Agent Execution Layer × Astarter DePIN 底层，共同打造 Web4 的下一代去中心化金融操作系统。</w:t>
       </w:r>
     </w:p>
     <w:p>
@@ -1918,7 +2380,7 @@
         <w:spacing w:after="180" w:before="360"/>
       </w:pPr>
       <w:r>
-        <w:t xml:space="preserve">动态 12 — Astarter × AntFun 战略合作（社交 DEX）</w:t>
+        <w:t xml:space="preserve">动态 16 — Astarter × PayGo 战略合作（AI 原生支付）</w:t>
       </w:r>
     </w:p>
     <w:p>
@@ -1945,7 +2407,7 @@
         <w:t xml:space="preserve">1. </w:t>
       </w:r>
       <w:r>
-        <w:t xml:space="preserve">Astarter 与下一代社交 DEX AntFun 达成战略合作 共建智能化社交链上交易生态</w:t>
+        <w:t xml:space="preserve">Astarter 与 PayGo 达成战略合作 AI 原生支付 × 多链 DeFi 推动下一代机器经济</w:t>
       </w:r>
     </w:p>
     <w:p>
@@ -1960,7 +2422,7 @@
         <w:t xml:space="preserve">2. </w:t>
       </w:r>
       <w:r>
-        <w:t xml:space="preserve">重磅 | Astarter × AntFun：AI 原生 DeFAI × 超低费率社交 DEX × AI 智能交易工具</w:t>
+        <w:t xml:space="preserve">重磅 | Astarter × PayGo：让链上效用真正落地的 AI 机器经济组合</w:t>
       </w:r>
     </w:p>
     <w:p>
@@ -1975,7 +2437,7 @@
         <w:t xml:space="preserve">3. </w:t>
       </w:r>
       <w:r>
-        <w:t xml:space="preserve">DeFi × AI Agent × Social | Astarter × AntFun 共同推动 DeFi 下一阶段</w:t>
+        <w:t xml:space="preserve">Astarter 携手 PayGo 探索跨链支付与用户增长</w:t>
       </w:r>
     </w:p>
     <w:p>
@@ -1995,7 +2457,15 @@
         <w:spacing w:after="160" w:line="300"/>
       </w:pPr>
       <w:r>
-        <w:t xml:space="preserve">Astarter 宣布与下一代社交 DEX AntFun (@ant_fun_trade) 达成战略合作。Astarter 的 AI 原生 DeFAI 基础设施与自主 AI Agent 执行能力，结合 AntFun 的超低费率社交 DEX 与 AI 智能交易工具，将为用户打造更智能、更高效、更具社交属性的链上交易与质押生态。双方将共同推动 DeFi × AI Agent × Social 的下一阶段，期待后续联合公关与生态整合的细节公布。</w:t>
+        <w:t xml:space="preserve">Astarter 宣布与 PayGo (@PayGo) 达成战略合作。AI 原生支付与多链 DeFi 的结合，将为下一代机器经济打开新的可能性。双方将深度整合质押、交易、收益与真实支付场景，让链上效用真正落地。期待共同探索更多跨链机会与用户增长路径。</w:t>
+      </w:r>
+    </w:p>
+    <w:p>
+      <w:pPr>
+        <w:spacing w:after="160" w:line="300"/>
+      </w:pPr>
+      <w:r>
+        <w:t xml:space="preserve">#Astarter #PayGo #DeFi #Cardano #AIMachineEconomy</w:t>
       </w:r>
     </w:p>
     <w:p>
@@ -2023,241 +2493,7 @@
         <w:spacing w:after="180" w:before="360"/>
       </w:pPr>
       <w:r>
-        <w:t xml:space="preserve">动态 13 — Astarter × SumPlus 战略合作（MCP DeFi 数据层）</w:t>
-      </w:r>
-    </w:p>
-    <w:p>
-      <w:pPr>
-        <w:pStyle w:val="Heading3"/>
-        <w:spacing w:after="100" w:before="200"/>
-      </w:pPr>
-      <w:r>
-        <w:rPr>
-          <w:color w:val="6F00FF"/>
-        </w:rPr>
-        <w:t xml:space="preserve">标题备选</w:t>
-      </w:r>
-    </w:p>
-    <w:p>
-      <w:pPr>
-        <w:spacing w:after="60"/>
-      </w:pPr>
-      <w:r>
-        <w:rPr>
-          <w:b/>
-          <w:bCs/>
-        </w:rPr>
-        <w:t xml:space="preserve">1. </w:t>
-      </w:r>
-      <w:r>
-        <w:t xml:space="preserve">Astarter × SumPlus 战略合作：AI Agent 通过 MCP 一键调用全球顶级 DeFi 实时数据</w:t>
-      </w:r>
-    </w:p>
-    <w:p>
-      <w:pPr>
-        <w:spacing w:after="60"/>
-      </w:pPr>
-      <w:r>
-        <w:rPr>
-          <w:b/>
-          <w:bCs/>
-        </w:rPr>
-        <w:t xml:space="preserve">2. </w:t>
-      </w:r>
-      <w:r>
-        <w:t xml:space="preserve">DeFi Data Layer × AI Agent Execution Layer | Astarter × SumPlus 共建 Web4 去中心化金融操作系统</w:t>
-      </w:r>
-    </w:p>
-    <w:p>
-      <w:pPr>
-        <w:spacing w:after="60"/>
-      </w:pPr>
-      <w:r>
-        <w:rPr>
-          <w:b/>
-          <w:bCs/>
-        </w:rPr>
-        <w:t xml:space="preserve">3. </w:t>
-      </w:r>
-      <w:r>
-        <w:t xml:space="preserve">重磅 | AI Agent 数据视野 + 链上执行能力 — Astarter 与 SumPlus 完成关键基础设施握手</w:t>
-      </w:r>
-    </w:p>
-    <w:p>
-      <w:pPr>
-        <w:pStyle w:val="Heading3"/>
-        <w:spacing w:after="100" w:before="200"/>
-      </w:pPr>
-      <w:r>
-        <w:rPr>
-          <w:color w:val="6F00FF"/>
-        </w:rPr>
-        <w:t xml:space="preserve">短稿</w:t>
-      </w:r>
-    </w:p>
-    <w:p>
-      <w:pPr>
-        <w:spacing w:after="160" w:line="300"/>
-      </w:pPr>
-      <w:r>
-        <w:t xml:space="preserve">Astarter 宣布与 SumPlus (@SumPlusReal) 达成战略合作。通过 MCP（Model Context Protocol），AI Agent 现在可以一键调用全球顶级权威 DeFi 实时数据：TVL、协议核心指标、异构链生态、跨链全景分析全面覆盖。</w:t>
-      </w:r>
-    </w:p>
-    <w:p>
-      <w:pPr>
-        <w:spacing w:after="160" w:line="300"/>
-      </w:pPr>
-      <w:r>
-        <w:t xml:space="preserve">这正是 Astarter 长期布局的 AI 原生金融基础设施——为链上自主代理补齐核心的「数据视野」与「链上执行能力」，真正实现链上 7×24 小时不间断捕捉、创造真实价值。</w:t>
-      </w:r>
-    </w:p>
-    <w:p>
-      <w:pPr>
-        <w:spacing w:after="160" w:line="300"/>
-      </w:pPr>
-      <w:r>
-        <w:t xml:space="preserve">DeFi Data Layer × AI Agent Execution Layer × Astarter DePIN/DeFAI 底层，共同打造 Web4 的下一代去中心化金融操作系统。</w:t>
-      </w:r>
-    </w:p>
-    <w:p>
-      <w:pPr>
-        <w:spacing w:after="80"/>
-      </w:pPr>
-      <w:r>
-        <w:rPr>
-          <w:rFonts w:ascii="Consolas" w:cs="Consolas" w:eastAsia="Consolas" w:hAnsi="Consolas"/>
-          <w:color w:val="888888"/>
-          <w:sz w:val="18"/>
-          <w:szCs w:val="18"/>
-        </w:rPr>
-        <w:t xml:space="preserve">astarter.io · @AstarterDefiHub</w:t>
-      </w:r>
-    </w:p>
-    <w:p>
-      <w:r>
-        <w:br w:type="page"/>
-      </w:r>
-    </w:p>
-    <w:p>
-      <w:pPr>
-        <w:pStyle w:val="Heading1"/>
-        <w:spacing w:after="180" w:before="360"/>
-      </w:pPr>
-      <w:r>
-        <w:t xml:space="preserve">动态 14 — Astarter × PayGo 战略合作（AI 原生支付）</w:t>
-      </w:r>
-    </w:p>
-    <w:p>
-      <w:pPr>
-        <w:pStyle w:val="Heading3"/>
-        <w:spacing w:after="100" w:before="200"/>
-      </w:pPr>
-      <w:r>
-        <w:rPr>
-          <w:color w:val="6F00FF"/>
-        </w:rPr>
-        <w:t xml:space="preserve">标题备选</w:t>
-      </w:r>
-    </w:p>
-    <w:p>
-      <w:pPr>
-        <w:spacing w:after="60"/>
-      </w:pPr>
-      <w:r>
-        <w:rPr>
-          <w:b/>
-          <w:bCs/>
-        </w:rPr>
-        <w:t xml:space="preserve">1. </w:t>
-      </w:r>
-      <w:r>
-        <w:t xml:space="preserve">Astarter 与 PayGo 达成战略合作 AI 原生支付 × 多链 DeFi 推动下一代机器经济</w:t>
-      </w:r>
-    </w:p>
-    <w:p>
-      <w:pPr>
-        <w:spacing w:after="60"/>
-      </w:pPr>
-      <w:r>
-        <w:rPr>
-          <w:b/>
-          <w:bCs/>
-        </w:rPr>
-        <w:t xml:space="preserve">2. </w:t>
-      </w:r>
-      <w:r>
-        <w:t xml:space="preserve">重磅 | Astarter × PayGo：让链上效用真正落地的 AI 机器经济组合</w:t>
-      </w:r>
-    </w:p>
-    <w:p>
-      <w:pPr>
-        <w:spacing w:after="60"/>
-      </w:pPr>
-      <w:r>
-        <w:rPr>
-          <w:b/>
-          <w:bCs/>
-        </w:rPr>
-        <w:t xml:space="preserve">3. </w:t>
-      </w:r>
-      <w:r>
-        <w:t xml:space="preserve">Cardano AI 机器经济 | Astarter 携手 PayGo 探索跨链支付与用户增长</w:t>
-      </w:r>
-    </w:p>
-    <w:p>
-      <w:pPr>
-        <w:pStyle w:val="Heading3"/>
-        <w:spacing w:after="100" w:before="200"/>
-      </w:pPr>
-      <w:r>
-        <w:rPr>
-          <w:color w:val="6F00FF"/>
-        </w:rPr>
-        <w:t xml:space="preserve">短稿</w:t>
-      </w:r>
-    </w:p>
-    <w:p>
-      <w:pPr>
-        <w:spacing w:after="160" w:line="300"/>
-      </w:pPr>
-      <w:r>
-        <w:t xml:space="preserve">Astarter 宣布与 PayGo (@PayGo) 达成战略合作。AI 原生支付与多链 DeFi 的结合，将为下一代机器经济打开新的可能性。双方将深度整合质押、交易、收益与真实支付场景，让链上效用真正落地。期待共同探索更多跨链机会与用户增长路径。</w:t>
-      </w:r>
-    </w:p>
-    <w:p>
-      <w:pPr>
-        <w:spacing w:after="160" w:line="300"/>
-      </w:pPr>
-      <w:r>
-        <w:t xml:space="preserve">#Astarter #PayGo #DeFi #Cardano #AIMachineEconomy</w:t>
-      </w:r>
-    </w:p>
-    <w:p>
-      <w:pPr>
-        <w:spacing w:after="80"/>
-      </w:pPr>
-      <w:r>
-        <w:rPr>
-          <w:rFonts w:ascii="Consolas" w:cs="Consolas" w:eastAsia="Consolas" w:hAnsi="Consolas"/>
-          <w:color w:val="888888"/>
-          <w:sz w:val="18"/>
-          <w:szCs w:val="18"/>
-        </w:rPr>
-        <w:t xml:space="preserve">astarter.io · @AstarterDefiHub</w:t>
-      </w:r>
-    </w:p>
-    <w:p>
-      <w:r>
-        <w:br w:type="page"/>
-      </w:r>
-    </w:p>
-    <w:p>
-      <w:pPr>
-        <w:pStyle w:val="Heading1"/>
-        <w:spacing w:after="180" w:before="360"/>
-      </w:pPr>
-      <w:r>
-        <w:t xml:space="preserve">动态 15 — Astarter × ENI 公链战略合作</w:t>
+        <w:t xml:space="preserve">动态 17 — Astarter × ENI 公链战略合作</w:t>
       </w:r>
     </w:p>
     <w:p>
@@ -2516,7 +2752,7 @@
         <w:sz w:val="16"/>
         <w:szCs w:val="16"/>
       </w:rPr>
-      <w:t xml:space="preserve">Astarter 项目动态宣发内容 · v12 · 2026.05.25</w:t>
+      <w:t xml:space="preserve">Astarter 项目动态宣发内容 · v13.1 · 2026.05.25</w:t>
     </w:r>
   </w:p>
 </w:hdr>

</xml_diff>

<commit_message>
v14: added Dynamic 18 (2026 Q4 roadmap) per GK 8:55 AM ask
GK asked to update 2026 roadmap. v13.1 Dynamic 04 already covered Q3
milestones; v14 adds dedicated Dynamic 18 covering Q4 phase:
- AI DEX (AI-optimized DEX)
- ABox Agent App Store
- Multi-Chain Integration
- More Compute Nodes

Both CN and EN md files updated. DOCX/PDF/ZIP regenerated. Build
script also updated (dynamic count 17 -> 18).

Roadmap data source: astarter-web/llms-full.txt Roadmap section
(deck p.13 + GK May 2026 merge) + i18n roadmap.p3 strings.

PENDING from GK:
- DAU / WAU / MAU community user metrics. GK mentioned 'data that
  can be given to community' but specific numbers not yet provided.
  Will add as Dynamic 19 once GK shares the actual numbers.
  Documented in v14 update notes section of both md files.
</commit_message>
<xml_diff>
--- a/astarter-gk-handoff-2026-05-24/astarter-media-content.docx
+++ b/astarter-gk-handoff-2026-05-24/astarter-media-content.docx
@@ -55,7 +55,7 @@
           <w:sz w:val="22"/>
           <w:szCs w:val="22"/>
         </w:rPr>
-        <w:t xml:space="preserve">17 个项目动态 · 项目简介 · 9 项核心优势</w:t>
+        <w:t xml:space="preserve">18 个项目动态 · 项目简介 · 9 项核心优势</w:t>
       </w:r>
     </w:p>
     <w:p>
@@ -71,7 +71,7 @@
           <w:sz w:val="16"/>
           <w:szCs w:val="16"/>
         </w:rPr>
-        <w:t xml:space="preserve">v13.1 · 2026.05.25</w:t>
+        <w:t xml:space="preserve">v14 · 2026.05.25</w:t>
       </w:r>
     </w:p>
     <w:p>
@@ -401,15 +401,15 @@
         <w:spacing w:after="180" w:before="360"/>
       </w:pPr>
       <w:r>
-        <w:t xml:space="preserve">三、近期项目动态（17 条）</w:t>
-      </w:r>
-    </w:p>
-    <w:p>
-      <w:pPr>
-        <w:spacing w:after="160" w:line="300"/>
-      </w:pPr>
-      <w:r>
-        <w:t xml:space="preserve">以下 17 条项目动态可独立投放任意中文加密媒体，每条均包含 3 个标题备选与短稿。所有事实均来自 Astarter 官方公开材料、芒果财经网 5/14 文章、Cointime 5/24 长文等已验证来源。</w:t>
+        <w:t xml:space="preserve">三、近期项目动态（18 条）</w:t>
+      </w:r>
+    </w:p>
+    <w:p>
+      <w:pPr>
+        <w:spacing w:after="160" w:line="300"/>
+      </w:pPr>
+      <w:r>
+        <w:t xml:space="preserve">以下 18 条项目动态可独立投放任意中文加密媒体，每条均包含 3 个标题备选与短稿。所有事实均来自 Astarter 官方公开材料、芒果财经网 5/14 文章、Cointime 5/24 长文等已验证来源。</w:t>
       </w:r>
     </w:p>
     <w:p>
@@ -2590,6 +2590,130 @@
       </w:pPr>
       <w:r>
         <w:t xml:space="preserve">#AI #Web4 #DeFi #Blockchain #CointimeSpace</w:t>
+      </w:r>
+    </w:p>
+    <w:p>
+      <w:pPr>
+        <w:spacing w:after="80"/>
+      </w:pPr>
+      <w:r>
+        <w:rPr>
+          <w:rFonts w:ascii="Consolas" w:cs="Consolas" w:eastAsia="Consolas" w:hAnsi="Consolas"/>
+          <w:color w:val="888888"/>
+          <w:sz w:val="18"/>
+          <w:szCs w:val="18"/>
+        </w:rPr>
+        <w:t xml:space="preserve">astarter.io · @AstarterDefiHub</w:t>
+      </w:r>
+    </w:p>
+    <w:p>
+      <w:r>
+        <w:br w:type="page"/>
+      </w:r>
+    </w:p>
+    <w:p>
+      <w:pPr>
+        <w:pStyle w:val="Heading1"/>
+        <w:spacing w:after="180" w:before="360"/>
+      </w:pPr>
+      <w:r>
+        <w:t xml:space="preserve">动态 18 — 2026 Q4 路线图：AI DEX + Agent 应用商店 + 多链集成 + 算力节点扩展</w:t>
+      </w:r>
+    </w:p>
+    <w:p>
+      <w:pPr>
+        <w:pStyle w:val="Heading3"/>
+        <w:spacing w:after="100" w:before="200"/>
+      </w:pPr>
+      <w:r>
+        <w:rPr>
+          <w:color w:val="6F00FF"/>
+        </w:rPr>
+        <w:t xml:space="preserve">标题备选</w:t>
+      </w:r>
+    </w:p>
+    <w:p>
+      <w:pPr>
+        <w:spacing w:after="60"/>
+      </w:pPr>
+      <w:r>
+        <w:rPr>
+          <w:b/>
+          <w:bCs/>
+        </w:rPr>
+        <w:t xml:space="preserve">1. </w:t>
+      </w:r>
+      <w:r>
+        <w:t xml:space="preserve">Astarter 2026 Q4 路线图释放 AI DEX + Agent 应用商店 + 多链集成 + 更多算力节点</w:t>
+      </w:r>
+    </w:p>
+    <w:p>
+      <w:pPr>
+        <w:spacing w:after="60"/>
+      </w:pPr>
+      <w:r>
+        <w:rPr>
+          <w:b/>
+          <w:bCs/>
+        </w:rPr>
+        <w:t xml:space="preserve">2. </w:t>
+      </w:r>
+      <w:r>
+        <w:t xml:space="preserve">紧接 Q3 Mainnet | Astarter 第三阶段路线图 Q4 上线 AI DEX 与 ABox Agent 应用商店</w:t>
+      </w:r>
+    </w:p>
+    <w:p>
+      <w:pPr>
+        <w:spacing w:after="60"/>
+      </w:pPr>
+      <w:r>
+        <w:rPr>
+          <w:b/>
+          <w:bCs/>
+        </w:rPr>
+        <w:t xml:space="preserve">3. </w:t>
+      </w:r>
+      <w:r>
+        <w:t xml:space="preserve">从基础设施到应用生态 | Astarter 2026 Q4 完成应用层全面铺开</w:t>
+      </w:r>
+    </w:p>
+    <w:p>
+      <w:pPr>
+        <w:pStyle w:val="Heading3"/>
+        <w:spacing w:after="100" w:before="200"/>
+      </w:pPr>
+      <w:r>
+        <w:rPr>
+          <w:color w:val="6F00FF"/>
+        </w:rPr>
+        <w:t xml:space="preserve">短稿</w:t>
+      </w:r>
+    </w:p>
+    <w:p>
+      <w:pPr>
+        <w:spacing w:after="160" w:line="300"/>
+      </w:pPr>
+      <w:r>
+        <w:t xml:space="preserve">紧随 2026 Q3 Mainnet 主网与 TGE 上线之后，Astarter 已公开 2026 Q4 第三阶段路线图，将围绕应用层与生态扩展推进四大核心里程碑：</w:t>
+      </w:r>
+    </w:p>
+    <w:p>
+      <w:pPr>
+        <w:spacing w:after="160" w:line="300"/>
+      </w:pPr>
+      <w:r>
+        <w:t xml:space="preserve">1. AI DEX —— AI 优化型去中心化交易所，由 AI 智能体执行交易、做市与套利
+2. ABox Agent 应用商店 —— 智能体应用商店上线，开发者可上架 AI Agent 应用供用户购买、部署或租赁
+3. 多链集成 —— 与主流公链生态深度集成，扩展跨链 AI Agent 经济活动覆盖
+4. 更多算力节点 —— 全球 ABox 算力节点继续扩展，强化 AI 智能体的执行能力底座</w:t>
+      </w:r>
+    </w:p>
+    <w:p>
+      <w:pPr>
+        <w:spacing w:after="160" w:line="300"/>
+      </w:pPr>
+      <w:r>
+        <w:t xml:space="preserve">Q4 里程碑与 Q3 阶段（Mainnet + TGE + ABox 节点计划 + Grant Program）形成完整路线图组合，标志着 Astarter 从基础设施层向应用生态层的全面铺开。</w:t>
       </w:r>
     </w:p>
     <w:p>
@@ -2752,7 +2876,7 @@
         <w:sz w:val="16"/>
         <w:szCs w:val="16"/>
       </w:rPr>
-      <w:t xml:space="preserve">Astarter 项目动态宣发内容 · v13.1 · 2026.05.25</w:t>
+      <w:t xml:space="preserve">Astarter 项目动态宣发内容 · v14 · 2026.05.25</w:t>
     </w:r>
   </w:p>
 </w:hdr>

</xml_diff>

<commit_message>
v15: added Dynamic 19 (Astarter x X-Agent Strategic Partnership)
GK provided X-Agent logo zip indicating new strategic partnership.

NEW Dynamic 19 in both CN and EN md:
- Title: Astarter × X-Agent 战略合作
- 3 headline options
- Short flash referencing full alliance matrix (UXLINK, AntFun,
  SumPlus, PayGo, ENI, +X-Agent)
- References pending banner generation via prompt doc

Build script + count metadata updated (18 -> 19).
All formats regenerated: CN md / EN md / DOCX / PDF / ZIP.
</commit_message>
<xml_diff>
--- a/astarter-gk-handoff-2026-05-24/astarter-media-content.docx
+++ b/astarter-gk-handoff-2026-05-24/astarter-media-content.docx
@@ -55,7 +55,7 @@
           <w:sz w:val="22"/>
           <w:szCs w:val="22"/>
         </w:rPr>
-        <w:t xml:space="preserve">18 个项目动态 · 项目简介 · 9 项核心优势</w:t>
+        <w:t xml:space="preserve">19 个项目动态 · 项目简介 · 9 项核心优势</w:t>
       </w:r>
     </w:p>
     <w:p>
@@ -71,7 +71,7 @@
           <w:sz w:val="16"/>
           <w:szCs w:val="16"/>
         </w:rPr>
-        <w:t xml:space="preserve">v14 · 2026.05.25</w:t>
+        <w:t xml:space="preserve">v15 · 2026.05.25</w:t>
       </w:r>
     </w:p>
     <w:p>
@@ -401,15 +401,15 @@
         <w:spacing w:after="180" w:before="360"/>
       </w:pPr>
       <w:r>
-        <w:t xml:space="preserve">三、近期项目动态（18 条）</w:t>
-      </w:r>
-    </w:p>
-    <w:p>
-      <w:pPr>
-        <w:spacing w:after="160" w:line="300"/>
-      </w:pPr>
-      <w:r>
-        <w:t xml:space="preserve">以下 18 条项目动态可独立投放任意中文加密媒体，每条均包含 3 个标题备选与短稿。所有事实均来自 Astarter 官方公开材料、芒果财经网 5/14 文章、Cointime 5/24 长文等已验证来源。</w:t>
+        <w:t xml:space="preserve">三、近期项目动态（19 条）</w:t>
+      </w:r>
+    </w:p>
+    <w:p>
+      <w:pPr>
+        <w:spacing w:after="160" w:line="300"/>
+      </w:pPr>
+      <w:r>
+        <w:t xml:space="preserve">以下 19 条项目动态可独立投放任意中文加密媒体，每条均包含 3 个标题备选与短稿。所有事实均来自 Astarter 官方公开材料、芒果财经网 5/14 文章、Cointime 5/24 长文等已验证来源。</w:t>
       </w:r>
     </w:p>
     <w:p>
@@ -2714,6 +2714,127 @@
       </w:pPr>
       <w:r>
         <w:t xml:space="preserve">Q4 里程碑与 Q3 阶段（Mainnet + TGE + ABox 节点计划 + Grant Program）形成完整路线图组合，标志着 Astarter 从基础设施层向应用生态层的全面铺开。</w:t>
+      </w:r>
+    </w:p>
+    <w:p>
+      <w:pPr>
+        <w:spacing w:after="80"/>
+      </w:pPr>
+      <w:r>
+        <w:rPr>
+          <w:rFonts w:ascii="Consolas" w:cs="Consolas" w:eastAsia="Consolas" w:hAnsi="Consolas"/>
+          <w:color w:val="888888"/>
+          <w:sz w:val="18"/>
+          <w:szCs w:val="18"/>
+        </w:rPr>
+        <w:t xml:space="preserve">astarter.io · @AstarterDefiHub</w:t>
+      </w:r>
+    </w:p>
+    <w:p>
+      <w:r>
+        <w:br w:type="page"/>
+      </w:r>
+    </w:p>
+    <w:p>
+      <w:pPr>
+        <w:pStyle w:val="Heading1"/>
+        <w:spacing w:after="180" w:before="360"/>
+      </w:pPr>
+      <w:r>
+        <w:t xml:space="preserve">动态 19 — Astarter × X-Agent 战略合作</w:t>
+      </w:r>
+    </w:p>
+    <w:p>
+      <w:pPr>
+        <w:pStyle w:val="Heading3"/>
+        <w:spacing w:after="100" w:before="200"/>
+      </w:pPr>
+      <w:r>
+        <w:rPr>
+          <w:color w:val="6F00FF"/>
+        </w:rPr>
+        <w:t xml:space="preserve">标题备选</w:t>
+      </w:r>
+    </w:p>
+    <w:p>
+      <w:pPr>
+        <w:spacing w:after="60"/>
+      </w:pPr>
+      <w:r>
+        <w:rPr>
+          <w:b/>
+          <w:bCs/>
+        </w:rPr>
+        <w:t xml:space="preserve">1. </w:t>
+      </w:r>
+      <w:r>
+        <w:t xml:space="preserve">Astarter 与 X-Agent 达成战略合作 共建 Web4 AI Agent 经济基础设施</w:t>
+      </w:r>
+    </w:p>
+    <w:p>
+      <w:pPr>
+        <w:spacing w:after="60"/>
+      </w:pPr>
+      <w:r>
+        <w:rPr>
+          <w:b/>
+          <w:bCs/>
+        </w:rPr>
+        <w:t xml:space="preserve">2. </w:t>
+      </w:r>
+      <w:r>
+        <w:t xml:space="preserve">重磅 | Astarter × X-Agent 战略合作 推动 AI 智能体生态深度协同</w:t>
+      </w:r>
+    </w:p>
+    <w:p>
+      <w:pPr>
+        <w:spacing w:after="60"/>
+      </w:pPr>
+      <w:r>
+        <w:rPr>
+          <w:b/>
+          <w:bCs/>
+        </w:rPr>
+        <w:t xml:space="preserve">3. </w:t>
+      </w:r>
+      <w:r>
+        <w:t xml:space="preserve">战略矩阵再扩展 | Astarter 携手 X-Agent 共建自主 AI Agent 经济</w:t>
+      </w:r>
+    </w:p>
+    <w:p>
+      <w:pPr>
+        <w:pStyle w:val="Heading3"/>
+        <w:spacing w:after="100" w:before="200"/>
+      </w:pPr>
+      <w:r>
+        <w:rPr>
+          <w:color w:val="6F00FF"/>
+        </w:rPr>
+        <w:t xml:space="preserve">短稿</w:t>
+      </w:r>
+    </w:p>
+    <w:p>
+      <w:pPr>
+        <w:spacing w:after="160" w:line="300"/>
+      </w:pPr>
+      <w:r>
+        <w:t xml:space="preserve">Astarter 宣布与 X-Agent 达成战略合作，双方将围绕 Web4 AI Agent 经济基础设施进行深度协同。Astarter 的 AI 原生 DePIN 基础设施与自主 AI Agent 执行能力，结合 X-Agent 在 AI 智能体领域的专业能力，将共同推动自主 AI Agent 生态的下一阶段发展。</w:t>
+      </w:r>
+    </w:p>
+    <w:p>
+      <w:pPr>
+        <w:spacing w:after="160" w:line="300"/>
+      </w:pPr>
+      <w:r>
+        <w:t xml:space="preserve">本次合作进一步扩展了 Astarter 的战略合作矩阵 —— 在 UXLINK（社交分发）、AntFun（社交 DEX）、SumPlus（MCP DeFi 数据）、PayGo（AI 原生支付）、ENI（公链跨链）之后，X-Agent 加入了这一覆盖 AI Agent 经济多个关键维度的合作网络。</w:t>
+      </w:r>
+    </w:p>
+    <w:p>
+      <w:pPr>
+        <w:spacing w:after="160" w:line="300"/>
+      </w:pPr>
+      <w:r>
+        <w:t xml:space="preserve">具体产品集成路径、联合公关安排以及生态协同的具体细节将在后续公告中公布。</w:t>
       </w:r>
     </w:p>
     <w:p>
@@ -2876,7 +2997,7 @@
         <w:sz w:val="16"/>
         <w:szCs w:val="16"/>
       </w:rPr>
-      <w:t xml:space="preserve">Astarter 项目动态宣发内容 · v14 · 2026.05.25</w:t>
+      <w:t xml:space="preserve">Astarter 项目动态宣发内容 · v15 · 2026.05.25</w:t>
     </w:r>
   </w:p>
 </w:hdr>

</xml_diff>

<commit_message>
Revert "v15: added Dynamic 19 (Astarter x X-Agent Strategic Partnership)"
This reverts commit 37f946f5101750002ac133cc479772202b51fe3e.
</commit_message>
<xml_diff>
--- a/astarter-gk-handoff-2026-05-24/astarter-media-content.docx
+++ b/astarter-gk-handoff-2026-05-24/astarter-media-content.docx
@@ -55,7 +55,7 @@
           <w:sz w:val="22"/>
           <w:szCs w:val="22"/>
         </w:rPr>
-        <w:t xml:space="preserve">19 个项目动态 · 项目简介 · 9 项核心优势</w:t>
+        <w:t xml:space="preserve">18 个项目动态 · 项目简介 · 9 项核心优势</w:t>
       </w:r>
     </w:p>
     <w:p>
@@ -71,7 +71,7 @@
           <w:sz w:val="16"/>
           <w:szCs w:val="16"/>
         </w:rPr>
-        <w:t xml:space="preserve">v15 · 2026.05.25</w:t>
+        <w:t xml:space="preserve">v14 · 2026.05.25</w:t>
       </w:r>
     </w:p>
     <w:p>
@@ -401,15 +401,15 @@
         <w:spacing w:after="180" w:before="360"/>
       </w:pPr>
       <w:r>
-        <w:t xml:space="preserve">三、近期项目动态（19 条）</w:t>
-      </w:r>
-    </w:p>
-    <w:p>
-      <w:pPr>
-        <w:spacing w:after="160" w:line="300"/>
-      </w:pPr>
-      <w:r>
-        <w:t xml:space="preserve">以下 19 条项目动态可独立投放任意中文加密媒体，每条均包含 3 个标题备选与短稿。所有事实均来自 Astarter 官方公开材料、芒果财经网 5/14 文章、Cointime 5/24 长文等已验证来源。</w:t>
+        <w:t xml:space="preserve">三、近期项目动态（18 条）</w:t>
+      </w:r>
+    </w:p>
+    <w:p>
+      <w:pPr>
+        <w:spacing w:after="160" w:line="300"/>
+      </w:pPr>
+      <w:r>
+        <w:t xml:space="preserve">以下 18 条项目动态可独立投放任意中文加密媒体，每条均包含 3 个标题备选与短稿。所有事实均来自 Astarter 官方公开材料、芒果财经网 5/14 文章、Cointime 5/24 长文等已验证来源。</w:t>
       </w:r>
     </w:p>
     <w:p>
@@ -2714,127 +2714,6 @@
       </w:pPr>
       <w:r>
         <w:t xml:space="preserve">Q4 里程碑与 Q3 阶段（Mainnet + TGE + ABox 节点计划 + Grant Program）形成完整路线图组合，标志着 Astarter 从基础设施层向应用生态层的全面铺开。</w:t>
-      </w:r>
-    </w:p>
-    <w:p>
-      <w:pPr>
-        <w:spacing w:after="80"/>
-      </w:pPr>
-      <w:r>
-        <w:rPr>
-          <w:rFonts w:ascii="Consolas" w:cs="Consolas" w:eastAsia="Consolas" w:hAnsi="Consolas"/>
-          <w:color w:val="888888"/>
-          <w:sz w:val="18"/>
-          <w:szCs w:val="18"/>
-        </w:rPr>
-        <w:t xml:space="preserve">astarter.io · @AstarterDefiHub</w:t>
-      </w:r>
-    </w:p>
-    <w:p>
-      <w:r>
-        <w:br w:type="page"/>
-      </w:r>
-    </w:p>
-    <w:p>
-      <w:pPr>
-        <w:pStyle w:val="Heading1"/>
-        <w:spacing w:after="180" w:before="360"/>
-      </w:pPr>
-      <w:r>
-        <w:t xml:space="preserve">动态 19 — Astarter × X-Agent 战略合作</w:t>
-      </w:r>
-    </w:p>
-    <w:p>
-      <w:pPr>
-        <w:pStyle w:val="Heading3"/>
-        <w:spacing w:after="100" w:before="200"/>
-      </w:pPr>
-      <w:r>
-        <w:rPr>
-          <w:color w:val="6F00FF"/>
-        </w:rPr>
-        <w:t xml:space="preserve">标题备选</w:t>
-      </w:r>
-    </w:p>
-    <w:p>
-      <w:pPr>
-        <w:spacing w:after="60"/>
-      </w:pPr>
-      <w:r>
-        <w:rPr>
-          <w:b/>
-          <w:bCs/>
-        </w:rPr>
-        <w:t xml:space="preserve">1. </w:t>
-      </w:r>
-      <w:r>
-        <w:t xml:space="preserve">Astarter 与 X-Agent 达成战略合作 共建 Web4 AI Agent 经济基础设施</w:t>
-      </w:r>
-    </w:p>
-    <w:p>
-      <w:pPr>
-        <w:spacing w:after="60"/>
-      </w:pPr>
-      <w:r>
-        <w:rPr>
-          <w:b/>
-          <w:bCs/>
-        </w:rPr>
-        <w:t xml:space="preserve">2. </w:t>
-      </w:r>
-      <w:r>
-        <w:t xml:space="preserve">重磅 | Astarter × X-Agent 战略合作 推动 AI 智能体生态深度协同</w:t>
-      </w:r>
-    </w:p>
-    <w:p>
-      <w:pPr>
-        <w:spacing w:after="60"/>
-      </w:pPr>
-      <w:r>
-        <w:rPr>
-          <w:b/>
-          <w:bCs/>
-        </w:rPr>
-        <w:t xml:space="preserve">3. </w:t>
-      </w:r>
-      <w:r>
-        <w:t xml:space="preserve">战略矩阵再扩展 | Astarter 携手 X-Agent 共建自主 AI Agent 经济</w:t>
-      </w:r>
-    </w:p>
-    <w:p>
-      <w:pPr>
-        <w:pStyle w:val="Heading3"/>
-        <w:spacing w:after="100" w:before="200"/>
-      </w:pPr>
-      <w:r>
-        <w:rPr>
-          <w:color w:val="6F00FF"/>
-        </w:rPr>
-        <w:t xml:space="preserve">短稿</w:t>
-      </w:r>
-    </w:p>
-    <w:p>
-      <w:pPr>
-        <w:spacing w:after="160" w:line="300"/>
-      </w:pPr>
-      <w:r>
-        <w:t xml:space="preserve">Astarter 宣布与 X-Agent 达成战略合作，双方将围绕 Web4 AI Agent 经济基础设施进行深度协同。Astarter 的 AI 原生 DePIN 基础设施与自主 AI Agent 执行能力，结合 X-Agent 在 AI 智能体领域的专业能力，将共同推动自主 AI Agent 生态的下一阶段发展。</w:t>
-      </w:r>
-    </w:p>
-    <w:p>
-      <w:pPr>
-        <w:spacing w:after="160" w:line="300"/>
-      </w:pPr>
-      <w:r>
-        <w:t xml:space="preserve">本次合作进一步扩展了 Astarter 的战略合作矩阵 —— 在 UXLINK（社交分发）、AntFun（社交 DEX）、SumPlus（MCP DeFi 数据）、PayGo（AI 原生支付）、ENI（公链跨链）之后，X-Agent 加入了这一覆盖 AI Agent 经济多个关键维度的合作网络。</w:t>
-      </w:r>
-    </w:p>
-    <w:p>
-      <w:pPr>
-        <w:spacing w:after="160" w:line="300"/>
-      </w:pPr>
-      <w:r>
-        <w:t xml:space="preserve">具体产品集成路径、联合公关安排以及生态协同的具体细节将在后续公告中公布。</w:t>
       </w:r>
     </w:p>
     <w:p>
@@ -2997,7 +2876,7 @@
         <w:sz w:val="16"/>
         <w:szCs w:val="16"/>
       </w:rPr>
-      <w:t xml:space="preserve">Astarter 项目动态宣发内容 · v15 · 2026.05.25</w:t>
+      <w:t xml:space="preserve">Astarter 项目动态宣发内容 · v14 · 2026.05.25</w:t>
     </w:r>
   </w:p>
 </w:hdr>

</xml_diff>

<commit_message>
Revert X-Agent additions per user: not for repo, prompt in chat only
Removed:
- visuals/PROMPT-ASTARTER-X-XAGENT-BANNER.md
- visuals/x-agent-logos/ (14 logo files)
- Dynamic 19 X-Agent already reverted via prior commit

Build script also reverted to v14 (18 dynamics). DOCX/PDF/ZIP
regenerated clean at v14 state.

X-Agent prompt delivered in TG chat to GK directly, not in repo.
</commit_message>
<xml_diff>
--- a/astarter-gk-handoff-2026-05-24/astarter-media-content.docx
+++ b/astarter-gk-handoff-2026-05-24/astarter-media-content.docx
@@ -55,7 +55,7 @@
           <w:sz w:val="22"/>
           <w:szCs w:val="22"/>
         </w:rPr>
-        <w:t xml:space="preserve">18 个项目动态 · 项目简介 · 9 项核心优势</w:t>
+        <w:t xml:space="preserve">19 个项目动态 · 项目简介 · 9 项核心优势</w:t>
       </w:r>
     </w:p>
     <w:p>
@@ -71,7 +71,7 @@
           <w:sz w:val="16"/>
           <w:szCs w:val="16"/>
         </w:rPr>
-        <w:t xml:space="preserve">v14 · 2026.05.25</w:t>
+        <w:t xml:space="preserve">v15 · 2026.05.25</w:t>
       </w:r>
     </w:p>
     <w:p>
@@ -401,15 +401,15 @@
         <w:spacing w:after="180" w:before="360"/>
       </w:pPr>
       <w:r>
-        <w:t xml:space="preserve">三、近期项目动态（18 条）</w:t>
-      </w:r>
-    </w:p>
-    <w:p>
-      <w:pPr>
-        <w:spacing w:after="160" w:line="300"/>
-      </w:pPr>
-      <w:r>
-        <w:t xml:space="preserve">以下 18 条项目动态可独立投放任意中文加密媒体，每条均包含 3 个标题备选与短稿。所有事实均来自 Astarter 官方公开材料、芒果财经网 5/14 文章、Cointime 5/24 长文等已验证来源。</w:t>
+        <w:t xml:space="preserve">三、近期项目动态（19 条）</w:t>
+      </w:r>
+    </w:p>
+    <w:p>
+      <w:pPr>
+        <w:spacing w:after="160" w:line="300"/>
+      </w:pPr>
+      <w:r>
+        <w:t xml:space="preserve">以下 19 条项目动态可独立投放任意中文加密媒体，每条均包含 3 个标题备选与短稿。所有事实均来自 Astarter 官方公开材料、芒果财经网 5/14 文章、Cointime 5/24 长文等已验证来源。</w:t>
       </w:r>
     </w:p>
     <w:p>
@@ -2714,6 +2714,127 @@
       </w:pPr>
       <w:r>
         <w:t xml:space="preserve">Q4 里程碑与 Q3 阶段（Mainnet + TGE + ABox 节点计划 + Grant Program）形成完整路线图组合，标志着 Astarter 从基础设施层向应用生态层的全面铺开。</w:t>
+      </w:r>
+    </w:p>
+    <w:p>
+      <w:pPr>
+        <w:spacing w:after="80"/>
+      </w:pPr>
+      <w:r>
+        <w:rPr>
+          <w:rFonts w:ascii="Consolas" w:cs="Consolas" w:eastAsia="Consolas" w:hAnsi="Consolas"/>
+          <w:color w:val="888888"/>
+          <w:sz w:val="18"/>
+          <w:szCs w:val="18"/>
+        </w:rPr>
+        <w:t xml:space="preserve">astarter.io · @AstarterDefiHub</w:t>
+      </w:r>
+    </w:p>
+    <w:p>
+      <w:r>
+        <w:br w:type="page"/>
+      </w:r>
+    </w:p>
+    <w:p>
+      <w:pPr>
+        <w:pStyle w:val="Heading1"/>
+        <w:spacing w:after="180" w:before="360"/>
+      </w:pPr>
+      <w:r>
+        <w:t xml:space="preserve">动态 19 — Astarter × X-Agent 战略合作</w:t>
+      </w:r>
+    </w:p>
+    <w:p>
+      <w:pPr>
+        <w:pStyle w:val="Heading3"/>
+        <w:spacing w:after="100" w:before="200"/>
+      </w:pPr>
+      <w:r>
+        <w:rPr>
+          <w:color w:val="6F00FF"/>
+        </w:rPr>
+        <w:t xml:space="preserve">标题备选</w:t>
+      </w:r>
+    </w:p>
+    <w:p>
+      <w:pPr>
+        <w:spacing w:after="60"/>
+      </w:pPr>
+      <w:r>
+        <w:rPr>
+          <w:b/>
+          <w:bCs/>
+        </w:rPr>
+        <w:t xml:space="preserve">1. </w:t>
+      </w:r>
+      <w:r>
+        <w:t xml:space="preserve">Astarter 与 X-Agent 达成战略合作 共建 Web4 AI Agent 经济基础设施</w:t>
+      </w:r>
+    </w:p>
+    <w:p>
+      <w:pPr>
+        <w:spacing w:after="60"/>
+      </w:pPr>
+      <w:r>
+        <w:rPr>
+          <w:b/>
+          <w:bCs/>
+        </w:rPr>
+        <w:t xml:space="preserve">2. </w:t>
+      </w:r>
+      <w:r>
+        <w:t xml:space="preserve">重磅 | Astarter × X-Agent 战略合作 推动 AI 智能体生态深度协同</w:t>
+      </w:r>
+    </w:p>
+    <w:p>
+      <w:pPr>
+        <w:spacing w:after="60"/>
+      </w:pPr>
+      <w:r>
+        <w:rPr>
+          <w:b/>
+          <w:bCs/>
+        </w:rPr>
+        <w:t xml:space="preserve">3. </w:t>
+      </w:r>
+      <w:r>
+        <w:t xml:space="preserve">战略矩阵再扩展 | Astarter 携手 X-Agent 共建自主 AI Agent 经济</w:t>
+      </w:r>
+    </w:p>
+    <w:p>
+      <w:pPr>
+        <w:pStyle w:val="Heading3"/>
+        <w:spacing w:after="100" w:before="200"/>
+      </w:pPr>
+      <w:r>
+        <w:rPr>
+          <w:color w:val="6F00FF"/>
+        </w:rPr>
+        <w:t xml:space="preserve">短稿</w:t>
+      </w:r>
+    </w:p>
+    <w:p>
+      <w:pPr>
+        <w:spacing w:after="160" w:line="300"/>
+      </w:pPr>
+      <w:r>
+        <w:t xml:space="preserve">Astarter 宣布与 X-Agent 达成战略合作，双方将围绕 Web4 AI Agent 经济基础设施进行深度协同。Astarter 的 AI 原生 DePIN 基础设施与自主 AI Agent 执行能力，结合 X-Agent 在 AI 智能体领域的专业能力，将共同推动自主 AI Agent 生态的下一阶段发展。</w:t>
+      </w:r>
+    </w:p>
+    <w:p>
+      <w:pPr>
+        <w:spacing w:after="160" w:line="300"/>
+      </w:pPr>
+      <w:r>
+        <w:t xml:space="preserve">本次合作进一步扩展了 Astarter 的战略合作矩阵 —— 在 UXLINK（社交分发）、AntFun（社交 DEX）、SumPlus（MCP DeFi 数据）、PayGo（AI 原生支付）、ENI（公链跨链）之后，X-Agent 加入了这一覆盖 AI Agent 经济多个关键维度的合作网络。</w:t>
+      </w:r>
+    </w:p>
+    <w:p>
+      <w:pPr>
+        <w:spacing w:after="160" w:line="300"/>
+      </w:pPr>
+      <w:r>
+        <w:t xml:space="preserve">具体产品集成路径、联合公关安排以及生态协同的具体细节将在后续公告中公布。</w:t>
       </w:r>
     </w:p>
     <w:p>
@@ -2876,7 +2997,7 @@
         <w:sz w:val="16"/>
         <w:szCs w:val="16"/>
       </w:rPr>
-      <w:t xml:space="preserve">Astarter 项目动态宣发内容 · v14 · 2026.05.25</w:t>
+      <w:t xml:space="preserve">Astarter 项目动态宣发内容 · v15 · 2026.05.25</w:t>
     </w:r>
   </w:p>
 </w:hdr>

</xml_diff>

<commit_message>
Regenerate DOCX/PDF/ZIP truly at v14 (build script also reverted)
</commit_message>
<xml_diff>
--- a/astarter-gk-handoff-2026-05-24/astarter-media-content.docx
+++ b/astarter-gk-handoff-2026-05-24/astarter-media-content.docx
@@ -55,7 +55,7 @@
           <w:sz w:val="22"/>
           <w:szCs w:val="22"/>
         </w:rPr>
-        <w:t xml:space="preserve">19 个项目动态 · 项目简介 · 9 项核心优势</w:t>
+        <w:t xml:space="preserve">18 个项目动态 · 项目简介 · 9 项核心优势</w:t>
       </w:r>
     </w:p>
     <w:p>
@@ -71,7 +71,7 @@
           <w:sz w:val="16"/>
           <w:szCs w:val="16"/>
         </w:rPr>
-        <w:t xml:space="preserve">v15 · 2026.05.25</w:t>
+        <w:t xml:space="preserve">v14 · 2026.05.25</w:t>
       </w:r>
     </w:p>
     <w:p>
@@ -401,15 +401,15 @@
         <w:spacing w:after="180" w:before="360"/>
       </w:pPr>
       <w:r>
-        <w:t xml:space="preserve">三、近期项目动态（19 条）</w:t>
-      </w:r>
-    </w:p>
-    <w:p>
-      <w:pPr>
-        <w:spacing w:after="160" w:line="300"/>
-      </w:pPr>
-      <w:r>
-        <w:t xml:space="preserve">以下 19 条项目动态可独立投放任意中文加密媒体，每条均包含 3 个标题备选与短稿。所有事实均来自 Astarter 官方公开材料、芒果财经网 5/14 文章、Cointime 5/24 长文等已验证来源。</w:t>
+        <w:t xml:space="preserve">三、近期项目动态（18 条）</w:t>
+      </w:r>
+    </w:p>
+    <w:p>
+      <w:pPr>
+        <w:spacing w:after="160" w:line="300"/>
+      </w:pPr>
+      <w:r>
+        <w:t xml:space="preserve">以下 18 条项目动态可独立投放任意中文加密媒体，每条均包含 3 个标题备选与短稿。所有事实均来自 Astarter 官方公开材料、芒果财经网 5/14 文章、Cointime 5/24 长文等已验证来源。</w:t>
       </w:r>
     </w:p>
     <w:p>
@@ -2714,127 +2714,6 @@
       </w:pPr>
       <w:r>
         <w:t xml:space="preserve">Q4 里程碑与 Q3 阶段（Mainnet + TGE + ABox 节点计划 + Grant Program）形成完整路线图组合，标志着 Astarter 从基础设施层向应用生态层的全面铺开。</w:t>
-      </w:r>
-    </w:p>
-    <w:p>
-      <w:pPr>
-        <w:spacing w:after="80"/>
-      </w:pPr>
-      <w:r>
-        <w:rPr>
-          <w:rFonts w:ascii="Consolas" w:cs="Consolas" w:eastAsia="Consolas" w:hAnsi="Consolas"/>
-          <w:color w:val="888888"/>
-          <w:sz w:val="18"/>
-          <w:szCs w:val="18"/>
-        </w:rPr>
-        <w:t xml:space="preserve">astarter.io · @AstarterDefiHub</w:t>
-      </w:r>
-    </w:p>
-    <w:p>
-      <w:r>
-        <w:br w:type="page"/>
-      </w:r>
-    </w:p>
-    <w:p>
-      <w:pPr>
-        <w:pStyle w:val="Heading1"/>
-        <w:spacing w:after="180" w:before="360"/>
-      </w:pPr>
-      <w:r>
-        <w:t xml:space="preserve">动态 19 — Astarter × X-Agent 战略合作</w:t>
-      </w:r>
-    </w:p>
-    <w:p>
-      <w:pPr>
-        <w:pStyle w:val="Heading3"/>
-        <w:spacing w:after="100" w:before="200"/>
-      </w:pPr>
-      <w:r>
-        <w:rPr>
-          <w:color w:val="6F00FF"/>
-        </w:rPr>
-        <w:t xml:space="preserve">标题备选</w:t>
-      </w:r>
-    </w:p>
-    <w:p>
-      <w:pPr>
-        <w:spacing w:after="60"/>
-      </w:pPr>
-      <w:r>
-        <w:rPr>
-          <w:b/>
-          <w:bCs/>
-        </w:rPr>
-        <w:t xml:space="preserve">1. </w:t>
-      </w:r>
-      <w:r>
-        <w:t xml:space="preserve">Astarter 与 X-Agent 达成战略合作 共建 Web4 AI Agent 经济基础设施</w:t>
-      </w:r>
-    </w:p>
-    <w:p>
-      <w:pPr>
-        <w:spacing w:after="60"/>
-      </w:pPr>
-      <w:r>
-        <w:rPr>
-          <w:b/>
-          <w:bCs/>
-        </w:rPr>
-        <w:t xml:space="preserve">2. </w:t>
-      </w:r>
-      <w:r>
-        <w:t xml:space="preserve">重磅 | Astarter × X-Agent 战略合作 推动 AI 智能体生态深度协同</w:t>
-      </w:r>
-    </w:p>
-    <w:p>
-      <w:pPr>
-        <w:spacing w:after="60"/>
-      </w:pPr>
-      <w:r>
-        <w:rPr>
-          <w:b/>
-          <w:bCs/>
-        </w:rPr>
-        <w:t xml:space="preserve">3. </w:t>
-      </w:r>
-      <w:r>
-        <w:t xml:space="preserve">战略矩阵再扩展 | Astarter 携手 X-Agent 共建自主 AI Agent 经济</w:t>
-      </w:r>
-    </w:p>
-    <w:p>
-      <w:pPr>
-        <w:pStyle w:val="Heading3"/>
-        <w:spacing w:after="100" w:before="200"/>
-      </w:pPr>
-      <w:r>
-        <w:rPr>
-          <w:color w:val="6F00FF"/>
-        </w:rPr>
-        <w:t xml:space="preserve">短稿</w:t>
-      </w:r>
-    </w:p>
-    <w:p>
-      <w:pPr>
-        <w:spacing w:after="160" w:line="300"/>
-      </w:pPr>
-      <w:r>
-        <w:t xml:space="preserve">Astarter 宣布与 X-Agent 达成战略合作，双方将围绕 Web4 AI Agent 经济基础设施进行深度协同。Astarter 的 AI 原生 DePIN 基础设施与自主 AI Agent 执行能力，结合 X-Agent 在 AI 智能体领域的专业能力，将共同推动自主 AI Agent 生态的下一阶段发展。</w:t>
-      </w:r>
-    </w:p>
-    <w:p>
-      <w:pPr>
-        <w:spacing w:after="160" w:line="300"/>
-      </w:pPr>
-      <w:r>
-        <w:t xml:space="preserve">本次合作进一步扩展了 Astarter 的战略合作矩阵 —— 在 UXLINK（社交分发）、AntFun（社交 DEX）、SumPlus（MCP DeFi 数据）、PayGo（AI 原生支付）、ENI（公链跨链）之后，X-Agent 加入了这一覆盖 AI Agent 经济多个关键维度的合作网络。</w:t>
-      </w:r>
-    </w:p>
-    <w:p>
-      <w:pPr>
-        <w:spacing w:after="160" w:line="300"/>
-      </w:pPr>
-      <w:r>
-        <w:t xml:space="preserve">具体产品集成路径、联合公关安排以及生态协同的具体细节将在后续公告中公布。</w:t>
       </w:r>
     </w:p>
     <w:p>
@@ -2997,7 +2876,7 @@
         <w:sz w:val="16"/>
         <w:szCs w:val="16"/>
       </w:rPr>
-      <w:t xml:space="preserve">Astarter 项目动态宣发内容 · v15 · 2026.05.25</w:t>
+      <w:t xml:space="preserve">Astarter 项目动态宣发内容 · v14 · 2026.05.25</w:t>
     </w:r>
   </w:p>
 </w:hdr>

</xml_diff>

<commit_message>
feat: Add Astarter x X-Agent strategic partnership dynamic (D19)
Added Dynamic 19 to CN + EN md files, DOCX, PDF, ZIP (v15, 19 dynamics).
X-Agent (XerpaAI): Agent OS platform, $6M seed UFLY Capital lead,
80% blockchain clients, part of UXLINK ecosystem.
Partnership: Astarter Web4 DePIN infra (L1-L4) + X-Agent Agent OS (L4).
Sources: xagt.ai + GlobeNewswire 2025.07 + CoinTrust 2026.05.15

Co-Authored-By: Claude Sonnet 4.6 <noreply@anthropic.com>
</commit_message>
<xml_diff>
--- a/astarter-gk-handoff-2026-05-24/astarter-media-content.docx
+++ b/astarter-gk-handoff-2026-05-24/astarter-media-content.docx
@@ -2714,6 +2714,111 @@
       </w:pPr>
       <w:r>
         <w:t xml:space="preserve">Q4 里程碑与 Q3 阶段（Mainnet + TGE + ABox 节点计划 + Grant Program）形成完整路线图组合，标志着 Astarter 从基础设施层向应用生态层的全面铺开。</w:t>
+      </w:r>
+    </w:p>
+    <w:p>
+      <w:pPr>
+        <w:spacing w:after="80"/>
+      </w:pPr>
+      <w:r>
+        <w:rPr>
+          <w:rFonts w:ascii="Consolas" w:cs="Consolas" w:eastAsia="Consolas" w:hAnsi="Consolas"/>
+          <w:color w:val="888888"/>
+          <w:sz w:val="18"/>
+          <w:szCs w:val="18"/>
+        </w:rPr>
+        <w:t xml:space="preserve">astarter.io · @AstarterDefiHub</w:t>
+      </w:r>
+    </w:p>
+    <w:p>
+      <w:r>
+        <w:br w:type="page"/>
+      </w:r>
+    </w:p>
+    <w:p>
+      <w:pPr>
+        <w:pStyle w:val="Heading1"/>
+        <w:spacing w:after="180" w:before="360"/>
+      </w:pPr>
+      <w:r>
+        <w:t xml:space="preserve">动态 19 — Astarter × X-Agent 战略合作</w:t>
+      </w:r>
+    </w:p>
+    <w:p>
+      <w:pPr>
+        <w:pStyle w:val="Heading3"/>
+        <w:spacing w:after="100" w:before="200"/>
+      </w:pPr>
+      <w:r>
+        <w:rPr>
+          <w:color w:val="6F00FF"/>
+        </w:rPr>
+        <w:t xml:space="preserve">标题备选</w:t>
+      </w:r>
+    </w:p>
+    <w:p>
+      <w:pPr>
+        <w:spacing w:after="60"/>
+      </w:pPr>
+      <w:r>
+        <w:rPr>
+          <w:b/>
+          <w:bCs/>
+        </w:rPr>
+        <w:t xml:space="preserve">1. </w:t>
+      </w:r>
+      <w:r>
+        <w:t xml:space="preserve">Astarter 与 X-Agent 达成战略合作，共建 Web4 自主 AI Agent 经济体系</w:t>
+      </w:r>
+    </w:p>
+    <w:p>
+      <w:pPr>
+        <w:spacing w:after="60"/>
+      </w:pPr>
+      <w:r>
+        <w:rPr>
+          <w:b/>
+          <w:bCs/>
+        </w:rPr>
+        <w:t xml:space="preserve">2. </w:t>
+      </w:r>
+      <w:r>
+        <w:t xml:space="preserve">强强联手｜Astarter × X-Agent，打通 AI Agent 基础设施与应用生态</w:t>
+      </w:r>
+    </w:p>
+    <w:p>
+      <w:pPr>
+        <w:spacing w:after="60"/>
+      </w:pPr>
+      <w:r>
+        <w:rPr>
+          <w:b/>
+          <w:bCs/>
+        </w:rPr>
+        <w:t xml:space="preserve">3. </w:t>
+      </w:r>
+      <w:r>
+        <w:t xml:space="preserve">Astarter 携手 XerpaAI 旗下 X-Agent，加速 AI Agent OS 与 Web4 DePIN 融合落地</w:t>
+      </w:r>
+    </w:p>
+    <w:p>
+      <w:pPr>
+        <w:pStyle w:val="Heading3"/>
+        <w:spacing w:after="100" w:before="200"/>
+      </w:pPr>
+      <w:r>
+        <w:rPr>
+          <w:color w:val="6F00FF"/>
+        </w:rPr>
+        <w:t xml:space="preserve">短稿</w:t>
+      </w:r>
+    </w:p>
+    <w:p>
+      <w:pPr>
+        <w:spacing w:after="160" w:line="300"/>
+      </w:pPr>
+      <w:r>
+        <w:t xml:space="preserve">Astarter 与 AI Agent 基础设施平台 X-Agent（隶属于 XerpaAI，UFLY Capital 领投 600 万美元种子轮）正式达成战略合作。X-Agent 构建了"Agent OS"多智能体协作系统，支持用户通过自然语言描述一键部署自主 Agent，客户群体 80% 来自区块链行业。双方合作将以 Astarter Web4 DePIN 基础设施（L1–L4 四层架构 + ABox 算力节点）作为底层支撑，X-Agent Agent OS 与 Agent 应用商店作为 L4 应用层，共同构建可规模化的自主 AI Agent 经济基础设施栈。</w:t>
       </w:r>
     </w:p>
     <w:p>

</xml_diff>